<commit_message>
Update project documentation and application initialization
</commit_message>
<xml_diff>
--- a/BananaCare_Documentation_Final.docx
+++ b/BananaCare_Documentation_Final.docx
@@ -13,6 +13,7 @@
           <w:szCs w:val="24"/>
         </w:rPr>
       </w:pPr>
+      <w:proofErr w:type="spellStart"/>
       <w:r>
         <w:rPr>
           <w:rFonts w:ascii="Arial" w:hAnsi="Arial" w:cs="Arial"/>
@@ -20,7 +21,17 @@
           <w:sz w:val="24"/>
           <w:szCs w:val="24"/>
         </w:rPr>
-        <w:t>BananaCare: Banana Farm Monitoring and Farmer Assistance Information System</w:t>
+        <w:t>BananaCare</w:t>
+      </w:r>
+      <w:proofErr w:type="spellEnd"/>
+      <w:r>
+        <w:rPr>
+          <w:rFonts w:ascii="Arial" w:hAnsi="Arial" w:cs="Arial"/>
+          <w:color w:val="000000" w:themeColor="text1"/>
+          <w:sz w:val="24"/>
+          <w:szCs w:val="24"/>
+        </w:rPr>
+        <w:t>: Banana Farm Monitoring and Farmer Assistance Information System</w:t>
       </w:r>
     </w:p>
     <w:p>
@@ -126,109 +137,95 @@
     <w:p/>
     <w:p>
       <w:pPr>
-        <w:pStyle w:val="ListNumber"/>
-        <w:rPr>
-          <w:rFonts w:cs="Arial"/>
-          <w:color w:val="000000" w:themeColor="text1"/>
-          <w:sz w:val="24"/>
-          <w:szCs w:val="24"/>
-        </w:rPr>
-      </w:pPr>
-      <w:r>
-        <w:rPr>
-          <w:rFonts w:cs="Arial"/>
-          <w:color w:val="000000" w:themeColor="text1"/>
-          <w:sz w:val="24"/>
-          <w:szCs w:val="24"/>
-        </w:rPr>
-        <w:t>To provide a system for registering and managing farmer and farm records.</w:t>
+        <w:pStyle w:val="Heading2"/>
+        <w:numPr>
+          <w:ilvl w:val="0"/>
+          <w:numId w:val="11"/>
+        </w:numPr>
+        <w:rPr>
+          <w:rFonts w:ascii="Arial" w:eastAsiaTheme="minorEastAsia" w:hAnsi="Arial" w:cs="Arial"/>
+          <w:b w:val="0"/>
+          <w:bCs w:val="0"/>
+          <w:color w:val="000000" w:themeColor="text1"/>
+          <w:sz w:val="24"/>
+          <w:szCs w:val="24"/>
+        </w:rPr>
+      </w:pPr>
+      <w:r>
+        <w:rPr>
+          <w:rFonts w:ascii="Arial" w:eastAsiaTheme="minorEastAsia" w:hAnsi="Arial" w:cs="Arial"/>
+          <w:b w:val="0"/>
+          <w:bCs w:val="0"/>
+          <w:color w:val="000000" w:themeColor="text1"/>
+          <w:sz w:val="24"/>
+          <w:szCs w:val="24"/>
+        </w:rPr>
+        <w:t>To manage farmer registration, farm profiles, and records in one accessible system.</w:t>
       </w:r>
     </w:p>
     <w:p>
       <w:pPr>
-        <w:pStyle w:val="ListNumber"/>
-        <w:rPr>
-          <w:rFonts w:cs="Arial"/>
-          <w:color w:val="000000" w:themeColor="text1"/>
-          <w:sz w:val="24"/>
-          <w:szCs w:val="24"/>
-        </w:rPr>
-      </w:pPr>
-      <w:r>
-        <w:rPr>
-          <w:rFonts w:cs="Arial"/>
-          <w:color w:val="000000" w:themeColor="text1"/>
-          <w:sz w:val="24"/>
-          <w:szCs w:val="24"/>
-        </w:rPr>
-        <w:t>To allow farmers to report banana diseases, pest infestations, and other farm conditions.</w:t>
+        <w:pStyle w:val="Heading2"/>
+        <w:numPr>
+          <w:ilvl w:val="0"/>
+          <w:numId w:val="11"/>
+        </w:numPr>
+        <w:rPr>
+          <w:rFonts w:ascii="Arial" w:eastAsiaTheme="minorEastAsia" w:hAnsi="Arial" w:cs="Arial"/>
+          <w:b w:val="0"/>
+          <w:bCs w:val="0"/>
+          <w:color w:val="000000" w:themeColor="text1"/>
+          <w:sz w:val="24"/>
+          <w:szCs w:val="24"/>
+        </w:rPr>
+      </w:pPr>
+      <w:r>
+        <w:rPr>
+          <w:rFonts w:ascii="Arial" w:eastAsiaTheme="minorEastAsia" w:hAnsi="Arial" w:cs="Arial"/>
+          <w:b w:val="0"/>
+          <w:bCs w:val="0"/>
+          <w:color w:val="000000" w:themeColor="text1"/>
+          <w:sz w:val="24"/>
+          <w:szCs w:val="24"/>
+        </w:rPr>
+        <w:t>To enable farmers to report banana diseases, pests, and farm conditions for agriculture staff to monitor and update.</w:t>
       </w:r>
     </w:p>
     <w:p>
       <w:pPr>
-        <w:pStyle w:val="ListNumber"/>
-        <w:rPr>
-          <w:rFonts w:cs="Arial"/>
-          <w:color w:val="000000" w:themeColor="text1"/>
-          <w:sz w:val="24"/>
-          <w:szCs w:val="24"/>
-        </w:rPr>
-      </w:pPr>
-      <w:r>
-        <w:rPr>
-          <w:rFonts w:cs="Arial"/>
-          <w:color w:val="000000" w:themeColor="text1"/>
-          <w:sz w:val="24"/>
-          <w:szCs w:val="24"/>
-        </w:rPr>
-        <w:t>To allow agriculture staff to monitor reported conditions and update their status.</w:t>
+        <w:pStyle w:val="Heading2"/>
+        <w:numPr>
+          <w:ilvl w:val="0"/>
+          <w:numId w:val="11"/>
+        </w:numPr>
+        <w:rPr>
+          <w:rFonts w:ascii="Arial" w:eastAsiaTheme="minorEastAsia" w:hAnsi="Arial" w:cs="Arial"/>
+          <w:b w:val="0"/>
+          <w:bCs w:val="0"/>
+          <w:color w:val="000000" w:themeColor="text1"/>
+          <w:sz w:val="24"/>
+          <w:szCs w:val="24"/>
+        </w:rPr>
+      </w:pPr>
+      <w:r>
+        <w:rPr>
+          <w:rFonts w:ascii="Arial" w:eastAsiaTheme="minorEastAsia" w:hAnsi="Arial" w:cs="Arial"/>
+          <w:b w:val="0"/>
+          <w:bCs w:val="0"/>
+          <w:color w:val="000000" w:themeColor="text1"/>
+          <w:sz w:val="24"/>
+          <w:szCs w:val="24"/>
+        </w:rPr>
+        <w:t>To track farmer assistance requests, staff recommendations, and follow-up actions.</w:t>
       </w:r>
     </w:p>
     <w:p>
       <w:pPr>
-        <w:pStyle w:val="ListNumber"/>
-        <w:rPr>
-          <w:rFonts w:cs="Arial"/>
-          <w:color w:val="000000" w:themeColor="text1"/>
-          <w:sz w:val="24"/>
-          <w:szCs w:val="24"/>
-        </w:rPr>
-      </w:pPr>
-      <w:r>
-        <w:rPr>
-          <w:rFonts w:cs="Arial"/>
-          <w:color w:val="000000" w:themeColor="text1"/>
-          <w:sz w:val="24"/>
-          <w:szCs w:val="24"/>
-        </w:rPr>
-        <w:t>To provide an assistance-tracking feature for farmer requests, recommendations, and follow-up actions.</w:t>
-      </w:r>
-    </w:p>
-    <w:p>
-      <w:pPr>
-        <w:pStyle w:val="ListNumber"/>
-        <w:rPr>
-          <w:rFonts w:cs="Arial"/>
-          <w:color w:val="000000" w:themeColor="text1"/>
-          <w:sz w:val="24"/>
-          <w:szCs w:val="24"/>
-        </w:rPr>
-      </w:pPr>
-      <w:r>
-        <w:rPr>
-          <w:rFonts w:cs="Arial"/>
-          <w:color w:val="000000" w:themeColor="text1"/>
-          <w:sz w:val="24"/>
-          <w:szCs w:val="24"/>
-        </w:rPr>
-        <w:t>To make banana farm information and assistance records easier to access and manage.</w:t>
-      </w:r>
-    </w:p>
-    <w:p>
-      <w:pPr>
         <w:pStyle w:val="Heading2"/>
         <w:rPr>
-          <w:rFonts w:ascii="Arial" w:hAnsi="Arial" w:cs="Arial"/>
+          <w:rFonts w:ascii="Arial" w:eastAsiaTheme="minorEastAsia" w:hAnsi="Arial" w:cs="Arial"/>
+          <w:b w:val="0"/>
+          <w:bCs w:val="0"/>
           <w:color w:val="000000" w:themeColor="text1"/>
           <w:sz w:val="24"/>
           <w:szCs w:val="24"/>
@@ -479,7 +476,27 @@
           <w:sz w:val="24"/>
           <w:szCs w:val="24"/>
         </w:rPr>
-        <w:t>This feature allows farmers to report observed farm problems and allows the Admin to monitor each report.</w:t>
+        <w:t xml:space="preserve">This feature allows farmers to report observed farm problems and allows the </w:t>
+      </w:r>
+      <w:proofErr w:type="gramStart"/>
+      <w:r>
+        <w:rPr>
+          <w:rFonts w:cs="Arial"/>
+          <w:color w:val="000000" w:themeColor="text1"/>
+          <w:sz w:val="24"/>
+          <w:szCs w:val="24"/>
+        </w:rPr>
+        <w:t>Admin</w:t>
+      </w:r>
+      <w:proofErr w:type="gramEnd"/>
+      <w:r>
+        <w:rPr>
+          <w:rFonts w:cs="Arial"/>
+          <w:color w:val="000000" w:themeColor="text1"/>
+          <w:sz w:val="24"/>
+          <w:szCs w:val="24"/>
+        </w:rPr>
+        <w:t xml:space="preserve"> to monitor each report.</w:t>
       </w:r>
     </w:p>
     <w:p>
@@ -738,7 +755,27 @@
           <w:sz w:val="24"/>
           <w:szCs w:val="24"/>
         </w:rPr>
-        <w:t>This feature allows farmers to request agricultural assistance and allows the Admin to record progress, recommendations, and completion details.</w:t>
+        <w:t xml:space="preserve">This feature allows farmers to request agricultural assistance and allows the </w:t>
+      </w:r>
+      <w:proofErr w:type="gramStart"/>
+      <w:r>
+        <w:rPr>
+          <w:rFonts w:cs="Arial"/>
+          <w:color w:val="000000" w:themeColor="text1"/>
+          <w:sz w:val="24"/>
+          <w:szCs w:val="24"/>
+        </w:rPr>
+        <w:t>Admin</w:t>
+      </w:r>
+      <w:proofErr w:type="gramEnd"/>
+      <w:r>
+        <w:rPr>
+          <w:rFonts w:cs="Arial"/>
+          <w:color w:val="000000" w:themeColor="text1"/>
+          <w:sz w:val="24"/>
+          <w:szCs w:val="24"/>
+        </w:rPr>
+        <w:t xml:space="preserve"> to record progress, recommendations, and completion details.</w:t>
       </w:r>
     </w:p>
     <w:p>
@@ -1049,6 +1086,7 @@
                 <w:szCs w:val="24"/>
               </w:rPr>
             </w:pPr>
+            <w:proofErr w:type="spellStart"/>
             <w:r>
               <w:rPr>
                 <w:rFonts w:cs="Arial"/>
@@ -1057,7 +1095,18 @@
                 <w:sz w:val="24"/>
                 <w:szCs w:val="24"/>
               </w:rPr>
-              <w:t>BananaCare Implementation</w:t>
+              <w:t>BananaCare</w:t>
+            </w:r>
+            <w:proofErr w:type="spellEnd"/>
+            <w:r>
+              <w:rPr>
+                <w:rFonts w:cs="Arial"/>
+                <w:b/>
+                <w:color w:val="000000" w:themeColor="text1"/>
+                <w:sz w:val="24"/>
+                <w:szCs w:val="24"/>
+              </w:rPr>
+              <w:t xml:space="preserve"> Implementation</w:t>
             </w:r>
           </w:p>
         </w:tc>
@@ -1107,7 +1156,27 @@
                 <w:sz w:val="24"/>
                 <w:szCs w:val="24"/>
               </w:rPr>
-              <w:t>Python/Flask, HTML, CSS, and Jinja-based BananaCare interface</w:t>
+              <w:t xml:space="preserve">Python/Flask, HTML, CSS, and Jinja-based </w:t>
+            </w:r>
+            <w:proofErr w:type="spellStart"/>
+            <w:r>
+              <w:rPr>
+                <w:rFonts w:cs="Arial"/>
+                <w:color w:val="000000" w:themeColor="text1"/>
+                <w:sz w:val="24"/>
+                <w:szCs w:val="24"/>
+              </w:rPr>
+              <w:t>BananaCare</w:t>
+            </w:r>
+            <w:proofErr w:type="spellEnd"/>
+            <w:r>
+              <w:rPr>
+                <w:rFonts w:cs="Arial"/>
+                <w:color w:val="000000" w:themeColor="text1"/>
+                <w:sz w:val="24"/>
+                <w:szCs w:val="24"/>
+              </w:rPr>
+              <w:t xml:space="preserve"> interface</w:t>
             </w:r>
           </w:p>
         </w:tc>
@@ -1702,7 +1771,27 @@
                 <w:sz w:val="24"/>
                 <w:szCs w:val="24"/>
               </w:rPr>
-              <w:t>Used to create the BananaCare-themed responsive interface, including layouts, cards, forms, tables, and buttons.</w:t>
+              <w:t xml:space="preserve">Used to create the </w:t>
+            </w:r>
+            <w:proofErr w:type="spellStart"/>
+            <w:r>
+              <w:rPr>
+                <w:rFonts w:cs="Arial"/>
+                <w:color w:val="000000" w:themeColor="text1"/>
+                <w:sz w:val="24"/>
+                <w:szCs w:val="24"/>
+              </w:rPr>
+              <w:t>BananaCare</w:t>
+            </w:r>
+            <w:proofErr w:type="spellEnd"/>
+            <w:r>
+              <w:rPr>
+                <w:rFonts w:cs="Arial"/>
+                <w:color w:val="000000" w:themeColor="text1"/>
+                <w:sz w:val="24"/>
+                <w:szCs w:val="24"/>
+              </w:rPr>
+              <w:t>-themed responsive interface, including layouts, cards, forms, tables, and buttons.</w:t>
             </w:r>
           </w:p>
         </w:tc>
@@ -1771,6 +1860,7 @@
                 <w:szCs w:val="24"/>
               </w:rPr>
             </w:pPr>
+            <w:proofErr w:type="spellStart"/>
             <w:r>
               <w:rPr>
                 <w:rFonts w:cs="Arial"/>
@@ -1780,6 +1870,7 @@
               </w:rPr>
               <w:t>SQLAlchemy</w:t>
             </w:r>
+            <w:proofErr w:type="spellEnd"/>
           </w:p>
         </w:tc>
         <w:tc>
@@ -1878,8 +1969,19 @@
                 <w:sz w:val="24"/>
                 <w:szCs w:val="24"/>
               </w:rPr>
-              <w:t>PostgreSQL/Psycopg</w:t>
+              <w:t>PostgreSQL/</w:t>
             </w:r>
+            <w:proofErr w:type="spellStart"/>
+            <w:r>
+              <w:rPr>
+                <w:rFonts w:cs="Arial"/>
+                <w:color w:val="000000" w:themeColor="text1"/>
+                <w:sz w:val="24"/>
+                <w:szCs w:val="24"/>
+              </w:rPr>
+              <w:t>Psycopg</w:t>
+            </w:r>
+            <w:proofErr w:type="spellEnd"/>
           </w:p>
         </w:tc>
         <w:tc>
@@ -1971,6 +2073,7 @@
                 <w:szCs w:val="24"/>
               </w:rPr>
             </w:pPr>
+            <w:proofErr w:type="spellStart"/>
             <w:r>
               <w:rPr>
                 <w:rFonts w:cs="Arial"/>
@@ -1980,6 +2083,7 @@
               </w:rPr>
               <w:t>Werkzeug</w:t>
             </w:r>
+            <w:proofErr w:type="spellEnd"/>
           </w:p>
         </w:tc>
         <w:tc>
@@ -2028,8 +2132,19 @@
                 <w:sz w:val="24"/>
                 <w:szCs w:val="24"/>
               </w:rPr>
-              <w:t>Python unittest</w:t>
+              <w:t xml:space="preserve">Python </w:t>
             </w:r>
+            <w:proofErr w:type="spellStart"/>
+            <w:r>
+              <w:rPr>
+                <w:rFonts w:cs="Arial"/>
+                <w:color w:val="000000" w:themeColor="text1"/>
+                <w:sz w:val="24"/>
+                <w:szCs w:val="24"/>
+              </w:rPr>
+              <w:t>unittest</w:t>
+            </w:r>
+            <w:proofErr w:type="spellEnd"/>
           </w:p>
         </w:tc>
         <w:tc>
@@ -2224,7 +2339,27 @@
           <w:sz w:val="24"/>
           <w:szCs w:val="24"/>
         </w:rPr>
-        <w:t>The purpose of this prompt was to brainstorm an appropriate agriculture-related mini information system and organize the selected idea into a clear Markdown proposal. The prompt asked ChatGPT to identify a practical problem, suggest a system title, define three manageable features, and prepare general and specific objectives suitable for the module assessment.</w:t>
+        <w:t xml:space="preserve">The purpose of this prompt was to brainstorm an appropriate agriculture-related </w:t>
+      </w:r>
+      <w:proofErr w:type="gramStart"/>
+      <w:r>
+        <w:rPr>
+          <w:rFonts w:cs="Arial"/>
+          <w:color w:val="000000" w:themeColor="text1"/>
+          <w:sz w:val="24"/>
+          <w:szCs w:val="24"/>
+        </w:rPr>
+        <w:t>mini information</w:t>
+      </w:r>
+      <w:proofErr w:type="gramEnd"/>
+      <w:r>
+        <w:rPr>
+          <w:rFonts w:cs="Arial"/>
+          <w:color w:val="000000" w:themeColor="text1"/>
+          <w:sz w:val="24"/>
+          <w:szCs w:val="24"/>
+        </w:rPr>
+        <w:t xml:space="preserve"> system and organize the selected idea into a clear Markdown proposal. The prompt asked ChatGPT to identify a practical problem, suggest a system title, define three manageable features, and prepare general and specific objectives suitable for the module assessment.</w:t>
       </w:r>
     </w:p>
     <w:p>
@@ -2293,8 +2428,9 @@
           <w:sz w:val="24"/>
           <w:szCs w:val="24"/>
         </w:rPr>
-        <w:t xml:space="preserve"> and Output </w:t>
-      </w:r>
+        <w:t xml:space="preserve"> and </w:t>
+      </w:r>
+      <w:proofErr w:type="gramStart"/>
       <w:r>
         <w:rPr>
           <w:rFonts w:cs="Arial"/>
@@ -2303,8 +2439,19 @@
           <w:sz w:val="24"/>
           <w:szCs w:val="24"/>
         </w:rPr>
+        <w:t xml:space="preserve">Output </w:t>
+      </w:r>
+      <w:r>
+        <w:rPr>
+          <w:rFonts w:cs="Arial"/>
+          <w:b/>
+          <w:color w:val="000000" w:themeColor="text1"/>
+          <w:sz w:val="24"/>
+          <w:szCs w:val="24"/>
+        </w:rPr>
         <w:t>:</w:t>
       </w:r>
+      <w:proofErr w:type="gramEnd"/>
     </w:p>
     <w:p>
       <w:pPr>
@@ -2694,7 +2841,27 @@
           <w:sz w:val="24"/>
           <w:szCs w:val="24"/>
         </w:rPr>
-        <w:t>The purpose of this prompt was to help us establish the overall structure, workflow, user roles, database choice, and main features of the BananaCare system before starting development.</w:t>
+        <w:t xml:space="preserve">The purpose of this prompt was to help us establish the overall structure, workflow, user roles, database choice, and main features of the </w:t>
+      </w:r>
+      <w:proofErr w:type="spellStart"/>
+      <w:r>
+        <w:rPr>
+          <w:rFonts w:cs="Arial"/>
+          <w:color w:val="000000" w:themeColor="text1"/>
+          <w:sz w:val="24"/>
+          <w:szCs w:val="24"/>
+        </w:rPr>
+        <w:t>BananaCare</w:t>
+      </w:r>
+      <w:proofErr w:type="spellEnd"/>
+      <w:r>
+        <w:rPr>
+          <w:rFonts w:cs="Arial"/>
+          <w:color w:val="000000" w:themeColor="text1"/>
+          <w:sz w:val="24"/>
+          <w:szCs w:val="24"/>
+        </w:rPr>
+        <w:t xml:space="preserve"> system before starting development.</w:t>
       </w:r>
     </w:p>
     <w:p>
@@ -3012,7 +3179,27 @@
           <w:sz w:val="24"/>
           <w:szCs w:val="24"/>
         </w:rPr>
-        <w:t>The purpose of this prompt was to generate the necessary code for the Farmer and Admin portals and the three major BananaCare modules while maintaining a simple project structure suitable for a classroom assessment.</w:t>
+        <w:t xml:space="preserve">The purpose of this prompt was to generate the necessary code for the Farmer and Admin portals and the three major </w:t>
+      </w:r>
+      <w:proofErr w:type="spellStart"/>
+      <w:r>
+        <w:rPr>
+          <w:rFonts w:cs="Arial"/>
+          <w:color w:val="000000" w:themeColor="text1"/>
+          <w:sz w:val="24"/>
+          <w:szCs w:val="24"/>
+        </w:rPr>
+        <w:t>BananaCare</w:t>
+      </w:r>
+      <w:proofErr w:type="spellEnd"/>
+      <w:r>
+        <w:rPr>
+          <w:rFonts w:cs="Arial"/>
+          <w:color w:val="000000" w:themeColor="text1"/>
+          <w:sz w:val="24"/>
+          <w:szCs w:val="24"/>
+        </w:rPr>
+        <w:t xml:space="preserve"> modules while maintaining a simple project structure suitable for a classroom assessment.</w:t>
       </w:r>
     </w:p>
     <w:p>
@@ -3051,7 +3238,27 @@
           <w:sz w:val="24"/>
           <w:szCs w:val="24"/>
         </w:rPr>
-        <w:t>We used the relevant generated Python, Flask, SQLAlchemy, HTML, Jinja, and CSS code. We reviewed the routes, model relationships, input handling, authentication rules, and page content. The implementation was adjusted to support a location-neutral farm template, separate user roles, local demonstration data, and the project requirements from the activity instructions.</w:t>
+        <w:t xml:space="preserve">We used the relevant generated Python, Flask, </w:t>
+      </w:r>
+      <w:proofErr w:type="spellStart"/>
+      <w:r>
+        <w:rPr>
+          <w:rFonts w:cs="Arial"/>
+          <w:color w:val="000000" w:themeColor="text1"/>
+          <w:sz w:val="24"/>
+          <w:szCs w:val="24"/>
+        </w:rPr>
+        <w:t>SQLAlchemy</w:t>
+      </w:r>
+      <w:proofErr w:type="spellEnd"/>
+      <w:r>
+        <w:rPr>
+          <w:rFonts w:cs="Arial"/>
+          <w:color w:val="000000" w:themeColor="text1"/>
+          <w:sz w:val="24"/>
+          <w:szCs w:val="24"/>
+        </w:rPr>
+        <w:t>, HTML, Jinja, and CSS code. We reviewed the routes, model relationships, input handling, authentication rules, and page content. The implementation was adjusted to support a location-neutral farm template, separate user roles, local demonstration data, and the project requirements from the activity instructions.</w:t>
       </w:r>
     </w:p>
     <w:p>
@@ -3479,6 +3686,7 @@
       <w:r>
         <w:rPr>
           <w:rFonts w:cs="Arial"/>
+          <w:noProof/>
           <w:color w:val="000000" w:themeColor="text1"/>
           <w:sz w:val="24"/>
           <w:szCs w:val="24"/>
@@ -3563,6 +3771,7 @@
       <w:r>
         <w:rPr>
           <w:rFonts w:cs="Arial"/>
+          <w:noProof/>
           <w:color w:val="000000" w:themeColor="text1"/>
           <w:sz w:val="24"/>
           <w:szCs w:val="24"/>
@@ -3640,7 +3849,16 @@
           <w:sz w:val="24"/>
           <w:szCs w:val="24"/>
         </w:rPr>
-        <w:t>AI Tool Used: OpenAI Codex</w:t>
+        <w:t xml:space="preserve">AI Tool Used: </w:t>
+      </w:r>
+      <w:r>
+        <w:rPr>
+          <w:rFonts w:cs="Arial"/>
+          <w:color w:val="000000" w:themeColor="text1"/>
+          <w:sz w:val="24"/>
+          <w:szCs w:val="24"/>
+        </w:rPr>
+        <w:t>Claude Sonnet 5</w:t>
       </w:r>
     </w:p>
     <w:p>
@@ -3679,7 +3897,27 @@
           <w:sz w:val="24"/>
           <w:szCs w:val="24"/>
         </w:rPr>
-        <w:t>The purpose of this prompt was to improve the readability, organization, maintainability, and consistency of the BananaCare source code without changing its intended behavior.</w:t>
+        <w:t xml:space="preserve">The purpose of this prompt was to improve the readability, organization, maintainability, and consistency of the </w:t>
+      </w:r>
+      <w:proofErr w:type="spellStart"/>
+      <w:r>
+        <w:rPr>
+          <w:rFonts w:cs="Arial"/>
+          <w:color w:val="000000" w:themeColor="text1"/>
+          <w:sz w:val="24"/>
+          <w:szCs w:val="24"/>
+        </w:rPr>
+        <w:t>BananaCare</w:t>
+      </w:r>
+      <w:proofErr w:type="spellEnd"/>
+      <w:r>
+        <w:rPr>
+          <w:rFonts w:cs="Arial"/>
+          <w:color w:val="000000" w:themeColor="text1"/>
+          <w:sz w:val="24"/>
+          <w:szCs w:val="24"/>
+        </w:rPr>
+        <w:t xml:space="preserve"> source code without changing its intended behavior.</w:t>
       </w:r>
     </w:p>
     <w:p>
@@ -3718,7 +3956,27 @@
           <w:sz w:val="24"/>
           <w:szCs w:val="24"/>
         </w:rPr>
-        <w:t>We centralized repeated status, role, problem-type, and assistance-type values in constants.py. We moved repeated form trimming and parsing into forms.py, improved names and formatting in the route modules, and updated the templates to use the centralized choices. The original version was retained in backups/bananacare-pre-refactor/, and both versions were tested to confirm that functionality was preserved.</w:t>
+        <w:t>We centralized repeated status, role, problem-type, and assistance-type values in constants.py. We moved repeated form trimming and parsing into forms.py, improved names and formatting in the route modules, and updated the templates to use the centralized choices. The original version was retained in backups/</w:t>
+      </w:r>
+      <w:proofErr w:type="spellStart"/>
+      <w:r>
+        <w:rPr>
+          <w:rFonts w:cs="Arial"/>
+          <w:color w:val="000000" w:themeColor="text1"/>
+          <w:sz w:val="24"/>
+          <w:szCs w:val="24"/>
+        </w:rPr>
+        <w:t>bananacare</w:t>
+      </w:r>
+      <w:proofErr w:type="spellEnd"/>
+      <w:r>
+        <w:rPr>
+          <w:rFonts w:cs="Arial"/>
+          <w:color w:val="000000" w:themeColor="text1"/>
+          <w:sz w:val="24"/>
+          <w:szCs w:val="24"/>
+        </w:rPr>
+        <w:t>-pre-refactor/, and both versions were tested to confirm that functionality was preserved.</w:t>
       </w:r>
     </w:p>
     <w:p>
@@ -3759,10 +4017,10 @@
           <w:szCs w:val="24"/>
         </w:rPr>
         <w:drawing>
-          <wp:inline distT="0" distB="0" distL="0" distR="0" wp14:anchorId="55DEAA5D" wp14:editId="4073C8C4">
-            <wp:extent cx="6583680" cy="878205"/>
-            <wp:effectExtent l="0" t="0" r="7620" b="0"/>
-            <wp:docPr id="936885287" name="Picture 1"/>
+          <wp:inline distT="0" distB="0" distL="0" distR="0" wp14:anchorId="06E65700" wp14:editId="33D2084C">
+            <wp:extent cx="6579235" cy="3728720"/>
+            <wp:effectExtent l="0" t="0" r="0" b="5080"/>
+            <wp:docPr id="1879449831" name="Picture 1"/>
             <wp:cNvGraphicFramePr>
               <a:graphicFrameLocks xmlns:a="http://schemas.openxmlformats.org/drawingml/2006/main" noChangeAspect="1"/>
             </wp:cNvGraphicFramePr>
@@ -3770,11 +4028,300 @@
               <a:graphicData uri="http://schemas.openxmlformats.org/drawingml/2006/picture">
                 <pic:pic xmlns:pic="http://schemas.openxmlformats.org/drawingml/2006/picture">
                   <pic:nvPicPr>
-                    <pic:cNvPr id="936885287" name=""/>
+                    <pic:cNvPr id="0" name="Picture 1"/>
+                    <pic:cNvPicPr>
+                      <a:picLocks noChangeAspect="1" noChangeArrowheads="1"/>
+                    </pic:cNvPicPr>
+                  </pic:nvPicPr>
+                  <pic:blipFill>
+                    <a:blip r:embed="rId16">
+                      <a:extLst>
+                        <a:ext uri="{28A0092B-C50C-407E-A947-70E740481C1C}">
+                          <a14:useLocalDpi xmlns:a14="http://schemas.microsoft.com/office/drawing/2010/main" val="0"/>
+                        </a:ext>
+                      </a:extLst>
+                    </a:blip>
+                    <a:srcRect/>
+                    <a:stretch>
+                      <a:fillRect/>
+                    </a:stretch>
+                  </pic:blipFill>
+                  <pic:spPr bwMode="auto">
+                    <a:xfrm>
+                      <a:off x="0" y="0"/>
+                      <a:ext cx="6579235" cy="3728720"/>
+                    </a:xfrm>
+                    <a:prstGeom prst="rect">
+                      <a:avLst/>
+                    </a:prstGeom>
+                    <a:noFill/>
+                    <a:ln>
+                      <a:noFill/>
+                    </a:ln>
+                  </pic:spPr>
+                </pic:pic>
+              </a:graphicData>
+            </a:graphic>
+          </wp:inline>
+        </w:drawing>
+      </w:r>
+    </w:p>
+    <w:p>
+      <w:pPr>
+        <w:rPr>
+          <w:rFonts w:cs="Arial"/>
+          <w:color w:val="000000" w:themeColor="text1"/>
+          <w:sz w:val="24"/>
+          <w:szCs w:val="24"/>
+        </w:rPr>
+      </w:pPr>
+      <w:r>
+        <w:rPr>
+          <w:rFonts w:cs="Arial"/>
+          <w:noProof/>
+          <w:color w:val="000000" w:themeColor="text1"/>
+          <w:sz w:val="24"/>
+          <w:szCs w:val="24"/>
+        </w:rPr>
+        <w:lastRenderedPageBreak/>
+        <w:drawing>
+          <wp:inline distT="0" distB="0" distL="0" distR="0" wp14:anchorId="7E60B6A6" wp14:editId="5F4BE900">
+            <wp:extent cx="6579235" cy="3918585"/>
+            <wp:effectExtent l="0" t="0" r="0" b="5715"/>
+            <wp:docPr id="883825958" name="Picture 9"/>
+            <wp:cNvGraphicFramePr>
+              <a:graphicFrameLocks xmlns:a="http://schemas.openxmlformats.org/drawingml/2006/main" noChangeAspect="1"/>
+            </wp:cNvGraphicFramePr>
+            <a:graphic xmlns:a="http://schemas.openxmlformats.org/drawingml/2006/main">
+              <a:graphicData uri="http://schemas.openxmlformats.org/drawingml/2006/picture">
+                <pic:pic xmlns:pic="http://schemas.openxmlformats.org/drawingml/2006/picture">
+                  <pic:nvPicPr>
+                    <pic:cNvPr id="0" name="Picture 9"/>
+                    <pic:cNvPicPr>
+                      <a:picLocks noChangeAspect="1" noChangeArrowheads="1"/>
+                    </pic:cNvPicPr>
+                  </pic:nvPicPr>
+                  <pic:blipFill>
+                    <a:blip r:embed="rId17">
+                      <a:extLst>
+                        <a:ext uri="{28A0092B-C50C-407E-A947-70E740481C1C}">
+                          <a14:useLocalDpi xmlns:a14="http://schemas.microsoft.com/office/drawing/2010/main" val="0"/>
+                        </a:ext>
+                      </a:extLst>
+                    </a:blip>
+                    <a:srcRect/>
+                    <a:stretch>
+                      <a:fillRect/>
+                    </a:stretch>
+                  </pic:blipFill>
+                  <pic:spPr bwMode="auto">
+                    <a:xfrm>
+                      <a:off x="0" y="0"/>
+                      <a:ext cx="6579235" cy="3918585"/>
+                    </a:xfrm>
+                    <a:prstGeom prst="rect">
+                      <a:avLst/>
+                    </a:prstGeom>
+                    <a:noFill/>
+                    <a:ln>
+                      <a:noFill/>
+                    </a:ln>
+                  </pic:spPr>
+                </pic:pic>
+              </a:graphicData>
+            </a:graphic>
+          </wp:inline>
+        </w:drawing>
+      </w:r>
+    </w:p>
+    <w:p>
+      <w:pPr>
+        <w:rPr>
+          <w:rFonts w:cs="Arial"/>
+          <w:color w:val="000000" w:themeColor="text1"/>
+          <w:sz w:val="24"/>
+          <w:szCs w:val="24"/>
+        </w:rPr>
+      </w:pPr>
+      <w:r>
+        <w:rPr>
+          <w:rFonts w:cs="Arial"/>
+          <w:b/>
+          <w:color w:val="000000" w:themeColor="text1"/>
+          <w:sz w:val="24"/>
+          <w:szCs w:val="24"/>
+        </w:rPr>
+        <w:t>Output:</w:t>
+      </w:r>
+      <w:r>
+        <w:rPr>
+          <w:rFonts w:cs="Arial"/>
+          <w:color w:val="000000" w:themeColor="text1"/>
+          <w:sz w:val="24"/>
+          <w:szCs w:val="24"/>
+        </w:rPr>
+        <w:t xml:space="preserve"> </w:t>
+      </w:r>
+    </w:p>
+    <w:p>
+      <w:pPr>
+        <w:rPr>
+          <w:rFonts w:cs="Arial"/>
+          <w:color w:val="000000" w:themeColor="text1"/>
+          <w:sz w:val="24"/>
+          <w:szCs w:val="24"/>
+        </w:rPr>
+      </w:pPr>
+      <w:r>
+        <w:rPr>
+          <w:rFonts w:cs="Arial"/>
+          <w:noProof/>
+          <w:color w:val="000000" w:themeColor="text1"/>
+          <w:sz w:val="24"/>
+          <w:szCs w:val="24"/>
+        </w:rPr>
+        <w:drawing>
+          <wp:inline distT="0" distB="0" distL="0" distR="0" wp14:anchorId="14221567" wp14:editId="04DC302A">
+            <wp:extent cx="4677967" cy="3917645"/>
+            <wp:effectExtent l="0" t="0" r="8890" b="6985"/>
+            <wp:docPr id="787293997" name="Picture 4"/>
+            <wp:cNvGraphicFramePr>
+              <a:graphicFrameLocks xmlns:a="http://schemas.openxmlformats.org/drawingml/2006/main" noChangeAspect="1"/>
+            </wp:cNvGraphicFramePr>
+            <a:graphic xmlns:a="http://schemas.openxmlformats.org/drawingml/2006/main">
+              <a:graphicData uri="http://schemas.openxmlformats.org/drawingml/2006/picture">
+                <pic:pic xmlns:pic="http://schemas.openxmlformats.org/drawingml/2006/picture">
+                  <pic:nvPicPr>
+                    <pic:cNvPr id="0" name="Picture 4"/>
+                    <pic:cNvPicPr>
+                      <a:picLocks noChangeAspect="1" noChangeArrowheads="1"/>
+                    </pic:cNvPicPr>
+                  </pic:nvPicPr>
+                  <pic:blipFill>
+                    <a:blip r:embed="rId18">
+                      <a:extLst>
+                        <a:ext uri="{28A0092B-C50C-407E-A947-70E740481C1C}">
+                          <a14:useLocalDpi xmlns:a14="http://schemas.microsoft.com/office/drawing/2010/main" val="0"/>
+                        </a:ext>
+                      </a:extLst>
+                    </a:blip>
+                    <a:srcRect/>
+                    <a:stretch>
+                      <a:fillRect/>
+                    </a:stretch>
+                  </pic:blipFill>
+                  <pic:spPr bwMode="auto">
+                    <a:xfrm>
+                      <a:off x="0" y="0"/>
+                      <a:ext cx="4684586" cy="3923188"/>
+                    </a:xfrm>
+                    <a:prstGeom prst="rect">
+                      <a:avLst/>
+                    </a:prstGeom>
+                    <a:noFill/>
+                    <a:ln>
+                      <a:noFill/>
+                    </a:ln>
+                  </pic:spPr>
+                </pic:pic>
+              </a:graphicData>
+            </a:graphic>
+          </wp:inline>
+        </w:drawing>
+      </w:r>
+    </w:p>
+    <w:p>
+      <w:pPr>
+        <w:rPr>
+          <w:rFonts w:cs="Arial"/>
+          <w:color w:val="000000" w:themeColor="text1"/>
+          <w:sz w:val="24"/>
+          <w:szCs w:val="24"/>
+        </w:rPr>
+      </w:pPr>
+      <w:r>
+        <w:rPr>
+          <w:rFonts w:cs="Arial"/>
+          <w:noProof/>
+          <w:color w:val="000000" w:themeColor="text1"/>
+          <w:sz w:val="24"/>
+          <w:szCs w:val="24"/>
+        </w:rPr>
+        <w:lastRenderedPageBreak/>
+        <w:drawing>
+          <wp:inline distT="0" distB="0" distL="0" distR="0" wp14:anchorId="4404B7E8" wp14:editId="7BF3DF3F">
+            <wp:extent cx="6579235" cy="4975860"/>
+            <wp:effectExtent l="0" t="0" r="0" b="0"/>
+            <wp:docPr id="2001169937" name="Picture 10"/>
+            <wp:cNvGraphicFramePr>
+              <a:graphicFrameLocks xmlns:a="http://schemas.openxmlformats.org/drawingml/2006/main" noChangeAspect="1"/>
+            </wp:cNvGraphicFramePr>
+            <a:graphic xmlns:a="http://schemas.openxmlformats.org/drawingml/2006/main">
+              <a:graphicData uri="http://schemas.openxmlformats.org/drawingml/2006/picture">
+                <pic:pic xmlns:pic="http://schemas.openxmlformats.org/drawingml/2006/picture">
+                  <pic:nvPicPr>
+                    <pic:cNvPr id="0" name="Picture 10"/>
+                    <pic:cNvPicPr>
+                      <a:picLocks noChangeAspect="1" noChangeArrowheads="1"/>
+                    </pic:cNvPicPr>
+                  </pic:nvPicPr>
+                  <pic:blipFill>
+                    <a:blip r:embed="rId19">
+                      <a:extLst>
+                        <a:ext uri="{28A0092B-C50C-407E-A947-70E740481C1C}">
+                          <a14:useLocalDpi xmlns:a14="http://schemas.microsoft.com/office/drawing/2010/main" val="0"/>
+                        </a:ext>
+                      </a:extLst>
+                    </a:blip>
+                    <a:srcRect/>
+                    <a:stretch>
+                      <a:fillRect/>
+                    </a:stretch>
+                  </pic:blipFill>
+                  <pic:spPr bwMode="auto">
+                    <a:xfrm>
+                      <a:off x="0" y="0"/>
+                      <a:ext cx="6579235" cy="4975860"/>
+                    </a:xfrm>
+                    <a:prstGeom prst="rect">
+                      <a:avLst/>
+                    </a:prstGeom>
+                    <a:noFill/>
+                    <a:ln>
+                      <a:noFill/>
+                    </a:ln>
+                  </pic:spPr>
+                </pic:pic>
+              </a:graphicData>
+            </a:graphic>
+          </wp:inline>
+        </w:drawing>
+      </w:r>
+      <w:r>
+        <w:rPr>
+          <w:rFonts w:cs="Arial"/>
+          <w:color w:val="000000" w:themeColor="text1"/>
+          <w:sz w:val="24"/>
+          <w:szCs w:val="24"/>
+        </w:rPr>
+        <w:lastRenderedPageBreak/>
+        <w:drawing>
+          <wp:inline distT="0" distB="0" distL="0" distR="0" wp14:anchorId="4AE982B5" wp14:editId="299ED3F4">
+            <wp:extent cx="6583680" cy="4272915"/>
+            <wp:effectExtent l="0" t="0" r="7620" b="0"/>
+            <wp:docPr id="1522982315" name="Picture 1"/>
+            <wp:cNvGraphicFramePr>
+              <a:graphicFrameLocks xmlns:a="http://schemas.openxmlformats.org/drawingml/2006/main" noChangeAspect="1"/>
+            </wp:cNvGraphicFramePr>
+            <a:graphic xmlns:a="http://schemas.openxmlformats.org/drawingml/2006/main">
+              <a:graphicData uri="http://schemas.openxmlformats.org/drawingml/2006/picture">
+                <pic:pic xmlns:pic="http://schemas.openxmlformats.org/drawingml/2006/picture">
+                  <pic:nvPicPr>
+                    <pic:cNvPr id="1522982315" name=""/>
                     <pic:cNvPicPr/>
                   </pic:nvPicPr>
                   <pic:blipFill>
-                    <a:blip r:embed="rId16"/>
+                    <a:blip r:embed="rId20"/>
                     <a:stretch>
                       <a:fillRect/>
                     </a:stretch>
@@ -3782,7 +4329,7 @@
                   <pic:spPr>
                     <a:xfrm>
                       <a:off x="0" y="0"/>
-                      <a:ext cx="6583680" cy="878205"/>
+                      <a:ext cx="6583680" cy="4272915"/>
                     </a:xfrm>
                     <a:prstGeom prst="rect">
                       <a:avLst/>
@@ -3807,53 +4354,16 @@
       <w:r>
         <w:rPr>
           <w:rFonts w:cs="Arial"/>
-          <w:b/>
-          <w:color w:val="000000" w:themeColor="text1"/>
-          <w:sz w:val="24"/>
-          <w:szCs w:val="24"/>
-        </w:rPr>
-        <w:t>Output:</w:t>
-      </w:r>
-      <w:r>
-        <w:rPr>
-          <w:rFonts w:cs="Arial"/>
-          <w:color w:val="000000" w:themeColor="text1"/>
-          <w:sz w:val="24"/>
-          <w:szCs w:val="24"/>
-        </w:rPr>
-        <w:t xml:space="preserve"> </w:t>
-      </w:r>
-    </w:p>
-    <w:p>
-      <w:pPr>
-        <w:rPr>
-          <w:rFonts w:cs="Arial"/>
-          <w:color w:val="000000" w:themeColor="text1"/>
-          <w:sz w:val="24"/>
-          <w:szCs w:val="24"/>
-        </w:rPr>
-      </w:pPr>
-      <w:r>
-        <w:rPr>
-          <w:rFonts w:cs="Arial"/>
           <w:noProof/>
           <w:color w:val="000000" w:themeColor="text1"/>
           <w:sz w:val="24"/>
           <w:szCs w:val="24"/>
         </w:rPr>
         <w:drawing>
-          <wp:anchor distT="0" distB="0" distL="114300" distR="114300" simplePos="0" relativeHeight="251662848" behindDoc="1" locked="0" layoutInCell="1" allowOverlap="1" wp14:anchorId="3683CEFF" wp14:editId="2D5145EB">
-            <wp:simplePos x="0" y="0"/>
-            <wp:positionH relativeFrom="column">
-              <wp:posOffset>533169</wp:posOffset>
-            </wp:positionH>
-            <wp:positionV relativeFrom="paragraph">
-              <wp:posOffset>92851</wp:posOffset>
-            </wp:positionV>
-            <wp:extent cx="5178105" cy="4809506"/>
-            <wp:effectExtent l="0" t="0" r="3810" b="0"/>
-            <wp:wrapNone/>
-            <wp:docPr id="1433554823" name="Picture 1"/>
+          <wp:inline distT="0" distB="0" distL="0" distR="0" wp14:anchorId="706F3FBA" wp14:editId="202AFAF4">
+            <wp:extent cx="6579235" cy="3954780"/>
+            <wp:effectExtent l="0" t="0" r="0" b="7620"/>
+            <wp:docPr id="1486904409" name="Picture 11"/>
             <wp:cNvGraphicFramePr>
               <a:graphicFrameLocks xmlns:a="http://schemas.openxmlformats.org/drawingml/2006/main" noChangeAspect="1"/>
             </wp:cNvGraphicFramePr>
@@ -3861,36 +4371,131 @@
               <a:graphicData uri="http://schemas.openxmlformats.org/drawingml/2006/picture">
                 <pic:pic xmlns:pic="http://schemas.openxmlformats.org/drawingml/2006/picture">
                   <pic:nvPicPr>
-                    <pic:cNvPr id="1433554823" name=""/>
-                    <pic:cNvPicPr/>
+                    <pic:cNvPr id="0" name="Picture 11"/>
+                    <pic:cNvPicPr>
+                      <a:picLocks noChangeAspect="1" noChangeArrowheads="1"/>
+                    </pic:cNvPicPr>
                   </pic:nvPicPr>
                   <pic:blipFill>
-                    <a:blip r:embed="rId17"/>
+                    <a:blip r:embed="rId21">
+                      <a:extLst>
+                        <a:ext uri="{28A0092B-C50C-407E-A947-70E740481C1C}">
+                          <a14:useLocalDpi xmlns:a14="http://schemas.microsoft.com/office/drawing/2010/main" val="0"/>
+                        </a:ext>
+                      </a:extLst>
+                    </a:blip>
+                    <a:srcRect/>
                     <a:stretch>
                       <a:fillRect/>
                     </a:stretch>
                   </pic:blipFill>
-                  <pic:spPr>
+                  <pic:spPr bwMode="auto">
                     <a:xfrm>
                       <a:off x="0" y="0"/>
-                      <a:ext cx="5178105" cy="4809506"/>
+                      <a:ext cx="6579235" cy="3954780"/>
                     </a:xfrm>
                     <a:prstGeom prst="rect">
                       <a:avLst/>
                     </a:prstGeom>
+                    <a:noFill/>
+                    <a:ln>
+                      <a:noFill/>
+                    </a:ln>
                   </pic:spPr>
                 </pic:pic>
               </a:graphicData>
             </a:graphic>
-            <wp14:sizeRelH relativeFrom="page">
-              <wp14:pctWidth>0</wp14:pctWidth>
-            </wp14:sizeRelH>
-            <wp14:sizeRelV relativeFrom="page">
-              <wp14:pctHeight>0</wp14:pctHeight>
-            </wp14:sizeRelV>
-          </wp:anchor>
+          </wp:inline>
         </w:drawing>
       </w:r>
+    </w:p>
+    <w:p>
+      <w:pPr>
+        <w:rPr>
+          <w:rFonts w:cs="Arial"/>
+          <w:color w:val="000000" w:themeColor="text1"/>
+          <w:sz w:val="24"/>
+          <w:szCs w:val="24"/>
+        </w:rPr>
+      </w:pPr>
+      <w:r>
+        <w:rPr>
+          <w:rFonts w:cs="Arial"/>
+          <w:noProof/>
+          <w:color w:val="000000" w:themeColor="text1"/>
+          <w:sz w:val="24"/>
+          <w:szCs w:val="24"/>
+        </w:rPr>
+        <w:lastRenderedPageBreak/>
+        <w:drawing>
+          <wp:inline distT="0" distB="0" distL="0" distR="0" wp14:anchorId="457877D1" wp14:editId="0CFC9F70">
+            <wp:extent cx="6579235" cy="5581650"/>
+            <wp:effectExtent l="0" t="0" r="0" b="0"/>
+            <wp:docPr id="963653609" name="Picture 5"/>
+            <wp:cNvGraphicFramePr>
+              <a:graphicFrameLocks xmlns:a="http://schemas.openxmlformats.org/drawingml/2006/main" noChangeAspect="1"/>
+            </wp:cNvGraphicFramePr>
+            <a:graphic xmlns:a="http://schemas.openxmlformats.org/drawingml/2006/main">
+              <a:graphicData uri="http://schemas.openxmlformats.org/drawingml/2006/picture">
+                <pic:pic xmlns:pic="http://schemas.openxmlformats.org/drawingml/2006/picture">
+                  <pic:nvPicPr>
+                    <pic:cNvPr id="0" name="Picture 5"/>
+                    <pic:cNvPicPr>
+                      <a:picLocks noChangeAspect="1" noChangeArrowheads="1"/>
+                    </pic:cNvPicPr>
+                  </pic:nvPicPr>
+                  <pic:blipFill>
+                    <a:blip r:embed="rId22">
+                      <a:extLst>
+                        <a:ext uri="{28A0092B-C50C-407E-A947-70E740481C1C}">
+                          <a14:useLocalDpi xmlns:a14="http://schemas.microsoft.com/office/drawing/2010/main" val="0"/>
+                        </a:ext>
+                      </a:extLst>
+                    </a:blip>
+                    <a:srcRect/>
+                    <a:stretch>
+                      <a:fillRect/>
+                    </a:stretch>
+                  </pic:blipFill>
+                  <pic:spPr bwMode="auto">
+                    <a:xfrm>
+                      <a:off x="0" y="0"/>
+                      <a:ext cx="6579235" cy="5581650"/>
+                    </a:xfrm>
+                    <a:prstGeom prst="rect">
+                      <a:avLst/>
+                    </a:prstGeom>
+                    <a:noFill/>
+                    <a:ln>
+                      <a:noFill/>
+                    </a:ln>
+                  </pic:spPr>
+                </pic:pic>
+              </a:graphicData>
+            </a:graphic>
+          </wp:inline>
+        </w:drawing>
+      </w:r>
+    </w:p>
+    <w:p>
+      <w:pPr>
+        <w:rPr>
+          <w:rFonts w:cs="Arial"/>
+          <w:color w:val="000000" w:themeColor="text1"/>
+          <w:sz w:val="24"/>
+          <w:szCs w:val="24"/>
+        </w:rPr>
+      </w:pPr>
+    </w:p>
+    <w:p>
+      <w:pPr>
+        <w:rPr>
+          <w:rFonts w:cs="Arial"/>
+          <w:color w:val="000000" w:themeColor="text1"/>
+          <w:sz w:val="24"/>
+          <w:szCs w:val="24"/>
+        </w:rPr>
+      </w:pPr>
     </w:p>
     <w:p>
       <w:pPr>
@@ -3955,7 +4560,7 @@
                     <pic:cNvPicPr/>
                   </pic:nvPicPr>
                   <pic:blipFill>
-                    <a:blip r:embed="rId18"/>
+                    <a:blip r:embed="rId23"/>
                     <a:stretch>
                       <a:fillRect/>
                     </a:stretch>
@@ -4055,16 +4660,15 @@
       <w:r>
         <w:rPr>
           <w:rFonts w:cs="Arial"/>
-          <w:noProof/>
           <w:color w:val="000000" w:themeColor="text1"/>
           <w:sz w:val="24"/>
           <w:szCs w:val="24"/>
         </w:rPr>
         <w:drawing>
-          <wp:inline distT="0" distB="0" distL="0" distR="0" wp14:anchorId="4B9E9CE6" wp14:editId="28FCB3C2">
-            <wp:extent cx="6583680" cy="5102860"/>
-            <wp:effectExtent l="0" t="0" r="7620" b="2540"/>
-            <wp:docPr id="909016055" name="Picture 1"/>
+          <wp:inline distT="0" distB="0" distL="0" distR="0" wp14:anchorId="2B93FA65" wp14:editId="1FC1F961">
+            <wp:extent cx="6583680" cy="7510780"/>
+            <wp:effectExtent l="0" t="0" r="7620" b="0"/>
+            <wp:docPr id="1686022080" name="Picture 1"/>
             <wp:cNvGraphicFramePr>
               <a:graphicFrameLocks xmlns:a="http://schemas.openxmlformats.org/drawingml/2006/main" noChangeAspect="1"/>
             </wp:cNvGraphicFramePr>
@@ -4072,11 +4676,11 @@
               <a:graphicData uri="http://schemas.openxmlformats.org/drawingml/2006/picture">
                 <pic:pic xmlns:pic="http://schemas.openxmlformats.org/drawingml/2006/picture">
                   <pic:nvPicPr>
-                    <pic:cNvPr id="909016055" name=""/>
+                    <pic:cNvPr id="1686022080" name=""/>
                     <pic:cNvPicPr/>
                   </pic:nvPicPr>
                   <pic:blipFill>
-                    <a:blip r:embed="rId19"/>
+                    <a:blip r:embed="rId24"/>
                     <a:stretch>
                       <a:fillRect/>
                     </a:stretch>
@@ -4084,7 +4688,7 @@
                   <pic:spPr>
                     <a:xfrm>
                       <a:off x="0" y="0"/>
-                      <a:ext cx="6583680" cy="5102860"/>
+                      <a:ext cx="6583680" cy="7510780"/>
                     </a:xfrm>
                     <a:prstGeom prst="rect">
                       <a:avLst/>
@@ -4202,7 +4806,27 @@
           <w:sz w:val="24"/>
           <w:szCs w:val="24"/>
         </w:rPr>
-        <w:t>Analysis – We reviewed the AI-generated system plan and compared it with the BananaCare proposal and activity requirements. We identified the necessary Farmer and Admin roles, the three required modules, the data each module needed, and the main workflow from farmer registration to Admin follow-up.</w:t>
+        <w:t xml:space="preserve">Analysis – We reviewed the AI-generated system plan and compared it with the </w:t>
+      </w:r>
+      <w:proofErr w:type="spellStart"/>
+      <w:r>
+        <w:rPr>
+          <w:rFonts w:cs="Arial"/>
+          <w:color w:val="000000" w:themeColor="text1"/>
+          <w:sz w:val="24"/>
+          <w:szCs w:val="24"/>
+        </w:rPr>
+        <w:t>BananaCare</w:t>
+      </w:r>
+      <w:proofErr w:type="spellEnd"/>
+      <w:r>
+        <w:rPr>
+          <w:rFonts w:cs="Arial"/>
+          <w:color w:val="000000" w:themeColor="text1"/>
+          <w:sz w:val="24"/>
+          <w:szCs w:val="24"/>
+        </w:rPr>
+        <w:t xml:space="preserve"> proposal and activity requirements. We identified the necessary Farmer and Admin roles, the three required modules, the data each module needed, and the main workflow from farmer registration to Admin follow-up.</w:t>
       </w:r>
     </w:p>
     <w:p>
@@ -4337,7 +4961,27 @@
           <w:sz w:val="24"/>
           <w:szCs w:val="24"/>
         </w:rPr>
-        <w:t>Modification – We installed the requirements in a separate command, reran the tests, and confirmed that they passed. We replaced the deprecated UTC timestamp function with a timezone-aware implementation and ran the complete test suite again.</w:t>
+        <w:t xml:space="preserve">Modification – We installed the requirements in a separate command, reran the tests, and confirmed that they passed. We replaced the deprecated UTC timestamp function with a </w:t>
+      </w:r>
+      <w:proofErr w:type="spellStart"/>
+      <w:r>
+        <w:rPr>
+          <w:rFonts w:cs="Arial"/>
+          <w:color w:val="000000" w:themeColor="text1"/>
+          <w:sz w:val="24"/>
+          <w:szCs w:val="24"/>
+        </w:rPr>
+        <w:t>timezone</w:t>
+      </w:r>
+      <w:proofErr w:type="spellEnd"/>
+      <w:r>
+        <w:rPr>
+          <w:rFonts w:cs="Arial"/>
+          <w:color w:val="000000" w:themeColor="text1"/>
+          <w:sz w:val="24"/>
+          <w:szCs w:val="24"/>
+        </w:rPr>
+        <w:t>-aware implementation and ran the complete test suite again.</w:t>
       </w:r>
     </w:p>
     <w:p>
@@ -4499,7 +5143,7 @@
                     <pic:cNvPicPr/>
                   </pic:nvPicPr>
                   <pic:blipFill>
-                    <a:blip r:embed="rId20"/>
+                    <a:blip r:embed="rId25"/>
                     <a:stretch>
                       <a:fillRect/>
                     </a:stretch>
@@ -4555,7 +5199,7 @@
                     <pic:cNvPicPr/>
                   </pic:nvPicPr>
                   <pic:blipFill>
-                    <a:blip r:embed="rId21"/>
+                    <a:blip r:embed="rId26"/>
                     <a:stretch>
                       <a:fillRect/>
                     </a:stretch>
@@ -4600,7 +5244,7 @@
                     <pic:cNvPicPr/>
                   </pic:nvPicPr>
                   <pic:blipFill>
-                    <a:blip r:embed="rId22"/>
+                    <a:blip r:embed="rId27"/>
                     <a:stretch>
                       <a:fillRect/>
                     </a:stretch>
@@ -4664,7 +5308,7 @@
                     <pic:cNvPicPr/>
                   </pic:nvPicPr>
                   <pic:blipFill>
-                    <a:blip r:embed="rId23"/>
+                    <a:blip r:embed="rId28"/>
                     <a:stretch>
                       <a:fillRect/>
                     </a:stretch>
@@ -4718,7 +5362,7 @@
                     <pic:cNvPicPr/>
                   </pic:nvPicPr>
                   <pic:blipFill>
-                    <a:blip r:embed="rId24"/>
+                    <a:blip r:embed="rId29"/>
                     <a:stretch>
                       <a:fillRect/>
                     </a:stretch>
@@ -6548,7 +7192,27 @@
                 <w:sz w:val="24"/>
                 <w:szCs w:val="24"/>
               </w:rPr>
-              <w:t>The Admin dashboard opened and displayed the test farmer record.</w:t>
+              <w:t xml:space="preserve">The </w:t>
+            </w:r>
+            <w:proofErr w:type="gramStart"/>
+            <w:r>
+              <w:rPr>
+                <w:rFonts w:cs="Arial"/>
+                <w:color w:val="000000" w:themeColor="text1"/>
+                <w:sz w:val="24"/>
+                <w:szCs w:val="24"/>
+              </w:rPr>
+              <w:t>Admin</w:t>
+            </w:r>
+            <w:proofErr w:type="gramEnd"/>
+            <w:r>
+              <w:rPr>
+                <w:rFonts w:cs="Arial"/>
+                <w:color w:val="000000" w:themeColor="text1"/>
+                <w:sz w:val="24"/>
+                <w:szCs w:val="24"/>
+              </w:rPr>
+              <w:t xml:space="preserve"> dashboard opened and displayed the test farmer record.</w:t>
             </w:r>
           </w:p>
         </w:tc>
@@ -6914,7 +7578,27 @@
                 <w:sz w:val="24"/>
                 <w:szCs w:val="24"/>
               </w:rPr>
-              <w:t>Farmer attempts to open the Admin dashboard.</w:t>
+              <w:t xml:space="preserve">Farmer attempts to open the </w:t>
+            </w:r>
+            <w:proofErr w:type="gramStart"/>
+            <w:r>
+              <w:rPr>
+                <w:rFonts w:cs="Arial"/>
+                <w:color w:val="000000" w:themeColor="text1"/>
+                <w:sz w:val="24"/>
+                <w:szCs w:val="24"/>
+              </w:rPr>
+              <w:t>Admin</w:t>
+            </w:r>
+            <w:proofErr w:type="gramEnd"/>
+            <w:r>
+              <w:rPr>
+                <w:rFonts w:cs="Arial"/>
+                <w:color w:val="000000" w:themeColor="text1"/>
+                <w:sz w:val="24"/>
+                <w:szCs w:val="24"/>
+              </w:rPr>
+              <w:t xml:space="preserve"> dashboard.</w:t>
             </w:r>
           </w:p>
         </w:tc>
@@ -7066,37 +7750,6 @@
         <w:lastRenderedPageBreak/>
         <w:t>FINAL SYSTEM SCREENSHOTS</w:t>
       </w:r>
-    </w:p>
-    <w:p>
-      <w:pPr>
-        <w:pStyle w:val="Heading2"/>
-        <w:rPr>
-          <w:rFonts w:ascii="Arial" w:hAnsi="Arial" w:cs="Arial"/>
-          <w:color w:val="000000" w:themeColor="text1"/>
-          <w:sz w:val="24"/>
-          <w:szCs w:val="24"/>
-        </w:rPr>
-      </w:pPr>
-      <w:r>
-        <w:rPr>
-          <w:rFonts w:ascii="Arial" w:hAnsi="Arial" w:cs="Arial"/>
-          <w:color w:val="000000" w:themeColor="text1"/>
-          <w:sz w:val="24"/>
-          <w:szCs w:val="24"/>
-        </w:rPr>
-        <w:t>Landing Page</w:t>
-      </w:r>
-    </w:p>
-    <w:p>
-      <w:pPr>
-        <w:pStyle w:val="Heading2"/>
-        <w:rPr>
-          <w:rFonts w:ascii="Arial" w:hAnsi="Arial" w:cs="Arial"/>
-          <w:color w:val="000000" w:themeColor="text1"/>
-          <w:sz w:val="24"/>
-          <w:szCs w:val="24"/>
-        </w:rPr>
-      </w:pPr>
       <w:r>
         <w:rPr>
           <w:rFonts w:ascii="Arial" w:eastAsiaTheme="minorEastAsia" w:hAnsi="Arial" w:cs="Arial"/>
@@ -7107,11 +7760,10 @@
           <w:sz w:val="24"/>
           <w:szCs w:val="24"/>
         </w:rPr>
-        <w:lastRenderedPageBreak/>
         <w:drawing>
-          <wp:inline distT="0" distB="0" distL="0" distR="0" wp14:anchorId="67293BC0" wp14:editId="2E0B958C">
-            <wp:extent cx="6583680" cy="4908550"/>
-            <wp:effectExtent l="0" t="0" r="7620" b="6350"/>
+          <wp:inline distT="0" distB="0" distL="0" distR="0" wp14:anchorId="6732AE9E" wp14:editId="57689D3E">
+            <wp:extent cx="6341423" cy="4727934"/>
+            <wp:effectExtent l="0" t="0" r="2540" b="0"/>
             <wp:docPr id="73802790" name="Picture 6"/>
             <wp:cNvGraphicFramePr>
               <a:graphicFrameLocks xmlns:a="http://schemas.openxmlformats.org/drawingml/2006/main" noChangeAspect="1"/>
@@ -7126,7 +7778,7 @@
                     </pic:cNvPicPr>
                   </pic:nvPicPr>
                   <pic:blipFill>
-                    <a:blip r:embed="rId25">
+                    <a:blip r:embed="rId30">
                       <a:extLst>
                         <a:ext uri="{28A0092B-C50C-407E-A947-70E740481C1C}">
                           <a14:useLocalDpi xmlns:a14="http://schemas.microsoft.com/office/drawing/2010/main" val="0"/>
@@ -7141,7 +7793,7 @@
                   <pic:spPr bwMode="auto">
                     <a:xfrm>
                       <a:off x="0" y="0"/>
-                      <a:ext cx="6583680" cy="4908550"/>
+                      <a:ext cx="6372446" cy="4751064"/>
                     </a:xfrm>
                     <a:prstGeom prst="rect">
                       <a:avLst/>
@@ -7157,6 +7809,28 @@
           </wp:inline>
         </w:drawing>
       </w:r>
+    </w:p>
+    <w:p>
+      <w:pPr>
+        <w:pStyle w:val="Heading1"/>
+        <w:jc w:val="center"/>
+        <w:rPr>
+          <w:rFonts w:ascii="Arial" w:hAnsi="Arial" w:cs="Arial"/>
+          <w:color w:val="000000" w:themeColor="text1"/>
+          <w:sz w:val="24"/>
+          <w:szCs w:val="24"/>
+        </w:rPr>
+      </w:pPr>
+      <w:r>
+        <w:rPr>
+          <w:rFonts w:ascii="Arial" w:hAnsi="Arial" w:cs="Arial"/>
+          <w:color w:val="000000" w:themeColor="text1"/>
+          <w:sz w:val="24"/>
+          <w:szCs w:val="24"/>
+        </w:rPr>
+        <w:lastRenderedPageBreak/>
+        <w:t>Landing Page</w:t>
+      </w:r>
       <w:r>
         <w:rPr>
           <w:rFonts w:ascii="Arial" w:eastAsiaTheme="minorEastAsia" w:hAnsi="Arial" w:cs="Arial"/>
@@ -7198,280 +7872,6 @@
                 <pic:pic xmlns:pic="http://schemas.openxmlformats.org/drawingml/2006/picture">
                   <pic:nvPicPr>
                     <pic:cNvPr id="43924707" name=""/>
-                    <pic:cNvPicPr/>
-                  </pic:nvPicPr>
-                  <pic:blipFill>
-                    <a:blip r:embed="rId26"/>
-                    <a:stretch>
-                      <a:fillRect/>
-                    </a:stretch>
-                  </pic:blipFill>
-                  <pic:spPr>
-                    <a:xfrm>
-                      <a:off x="0" y="0"/>
-                      <a:ext cx="6583680" cy="3275965"/>
-                    </a:xfrm>
-                    <a:prstGeom prst="rect">
-                      <a:avLst/>
-                    </a:prstGeom>
-                  </pic:spPr>
-                </pic:pic>
-              </a:graphicData>
-            </a:graphic>
-          </wp:inline>
-        </w:drawing>
-      </w:r>
-      <w:r>
-        <w:rPr>
-          <w:rFonts w:cs="Arial"/>
-          <w:color w:val="000000" w:themeColor="text1"/>
-          <w:sz w:val="24"/>
-          <w:szCs w:val="24"/>
-        </w:rPr>
-        <w:lastRenderedPageBreak/>
-        <w:t xml:space="preserve"> </w:t>
-      </w:r>
-      <w:r>
-        <w:rPr>
-          <w:rFonts w:cs="Arial"/>
-          <w:noProof/>
-          <w:color w:val="000000" w:themeColor="text1"/>
-          <w:sz w:val="24"/>
-          <w:szCs w:val="24"/>
-        </w:rPr>
-        <w:drawing>
-          <wp:inline distT="0" distB="0" distL="0" distR="0" wp14:anchorId="0B9E40D8" wp14:editId="30A8880B">
-            <wp:extent cx="6583680" cy="3275965"/>
-            <wp:effectExtent l="0" t="0" r="7620" b="635"/>
-            <wp:docPr id="118094564" name="Picture 1"/>
-            <wp:cNvGraphicFramePr>
-              <a:graphicFrameLocks xmlns:a="http://schemas.openxmlformats.org/drawingml/2006/main" noChangeAspect="1"/>
-            </wp:cNvGraphicFramePr>
-            <a:graphic xmlns:a="http://schemas.openxmlformats.org/drawingml/2006/main">
-              <a:graphicData uri="http://schemas.openxmlformats.org/drawingml/2006/picture">
-                <pic:pic xmlns:pic="http://schemas.openxmlformats.org/drawingml/2006/picture">
-                  <pic:nvPicPr>
-                    <pic:cNvPr id="118094564" name=""/>
-                    <pic:cNvPicPr/>
-                  </pic:nvPicPr>
-                  <pic:blipFill>
-                    <a:blip r:embed="rId27"/>
-                    <a:stretch>
-                      <a:fillRect/>
-                    </a:stretch>
-                  </pic:blipFill>
-                  <pic:spPr>
-                    <a:xfrm>
-                      <a:off x="0" y="0"/>
-                      <a:ext cx="6583680" cy="3275965"/>
-                    </a:xfrm>
-                    <a:prstGeom prst="rect">
-                      <a:avLst/>
-                    </a:prstGeom>
-                  </pic:spPr>
-                </pic:pic>
-              </a:graphicData>
-            </a:graphic>
-          </wp:inline>
-        </w:drawing>
-      </w:r>
-    </w:p>
-    <w:p>
-      <w:pPr>
-        <w:pStyle w:val="IntenseQuote"/>
-        <w:ind w:left="0"/>
-        <w:rPr>
-          <w:rFonts w:cs="Arial"/>
-          <w:color w:val="000000" w:themeColor="text1"/>
-          <w:sz w:val="24"/>
-          <w:szCs w:val="24"/>
-        </w:rPr>
-      </w:pPr>
-      <w:r>
-        <w:rPr>
-          <w:rFonts w:cs="Arial"/>
-          <w:noProof/>
-          <w:color w:val="000000" w:themeColor="text1"/>
-          <w:sz w:val="24"/>
-          <w:szCs w:val="24"/>
-        </w:rPr>
-        <w:drawing>
-          <wp:inline distT="0" distB="0" distL="0" distR="0" wp14:anchorId="29250992" wp14:editId="7622AFF5">
-            <wp:extent cx="6583680" cy="3275965"/>
-            <wp:effectExtent l="0" t="0" r="7620" b="635"/>
-            <wp:docPr id="95836812" name="Picture 1"/>
-            <wp:cNvGraphicFramePr>
-              <a:graphicFrameLocks xmlns:a="http://schemas.openxmlformats.org/drawingml/2006/main" noChangeAspect="1"/>
-            </wp:cNvGraphicFramePr>
-            <a:graphic xmlns:a="http://schemas.openxmlformats.org/drawingml/2006/main">
-              <a:graphicData uri="http://schemas.openxmlformats.org/drawingml/2006/picture">
-                <pic:pic xmlns:pic="http://schemas.openxmlformats.org/drawingml/2006/picture">
-                  <pic:nvPicPr>
-                    <pic:cNvPr id="95836812" name=""/>
-                    <pic:cNvPicPr/>
-                  </pic:nvPicPr>
-                  <pic:blipFill>
-                    <a:blip r:embed="rId28"/>
-                    <a:stretch>
-                      <a:fillRect/>
-                    </a:stretch>
-                  </pic:blipFill>
-                  <pic:spPr>
-                    <a:xfrm>
-                      <a:off x="0" y="0"/>
-                      <a:ext cx="6583680" cy="3275965"/>
-                    </a:xfrm>
-                    <a:prstGeom prst="rect">
-                      <a:avLst/>
-                    </a:prstGeom>
-                  </pic:spPr>
-                </pic:pic>
-              </a:graphicData>
-            </a:graphic>
-          </wp:inline>
-        </w:drawing>
-      </w:r>
-    </w:p>
-    <w:p>
-      <w:pPr>
-        <w:pStyle w:val="Heading2"/>
-        <w:rPr>
-          <w:rFonts w:ascii="Arial" w:hAnsi="Arial" w:cs="Arial"/>
-          <w:color w:val="000000" w:themeColor="text1"/>
-          <w:sz w:val="24"/>
-          <w:szCs w:val="24"/>
-        </w:rPr>
-      </w:pPr>
-      <w:r>
-        <w:rPr>
-          <w:rFonts w:ascii="Arial" w:hAnsi="Arial" w:cs="Arial"/>
-          <w:color w:val="000000" w:themeColor="text1"/>
-          <w:sz w:val="24"/>
-          <w:szCs w:val="24"/>
-        </w:rPr>
-        <w:lastRenderedPageBreak/>
-        <w:t>Farmer Side (Pages)</w:t>
-      </w:r>
-    </w:p>
-    <w:p>
-      <w:pPr>
-        <w:pStyle w:val="IntenseQuote"/>
-        <w:ind w:left="0"/>
-        <w:rPr>
-          <w:rFonts w:cs="Arial"/>
-          <w:color w:val="000000" w:themeColor="text1"/>
-          <w:sz w:val="24"/>
-          <w:szCs w:val="24"/>
-        </w:rPr>
-      </w:pPr>
-      <w:r>
-        <w:rPr>
-          <w:rFonts w:cs="Arial"/>
-          <w:noProof/>
-          <w:color w:val="000000" w:themeColor="text1"/>
-          <w:sz w:val="24"/>
-          <w:szCs w:val="24"/>
-        </w:rPr>
-        <w:drawing>
-          <wp:inline distT="0" distB="0" distL="0" distR="0" wp14:anchorId="02BD52FB" wp14:editId="342519C3">
-            <wp:extent cx="6583680" cy="4618990"/>
-            <wp:effectExtent l="0" t="0" r="7620" b="0"/>
-            <wp:docPr id="1364353557" name="Picture 1"/>
-            <wp:cNvGraphicFramePr>
-              <a:graphicFrameLocks xmlns:a="http://schemas.openxmlformats.org/drawingml/2006/main" noChangeAspect="1"/>
-            </wp:cNvGraphicFramePr>
-            <a:graphic xmlns:a="http://schemas.openxmlformats.org/drawingml/2006/main">
-              <a:graphicData uri="http://schemas.openxmlformats.org/drawingml/2006/picture">
-                <pic:pic xmlns:pic="http://schemas.openxmlformats.org/drawingml/2006/picture">
-                  <pic:nvPicPr>
-                    <pic:cNvPr id="1364353557" name=""/>
-                    <pic:cNvPicPr/>
-                  </pic:nvPicPr>
-                  <pic:blipFill>
-                    <a:blip r:embed="rId29"/>
-                    <a:stretch>
-                      <a:fillRect/>
-                    </a:stretch>
-                  </pic:blipFill>
-                  <pic:spPr>
-                    <a:xfrm>
-                      <a:off x="0" y="0"/>
-                      <a:ext cx="6583680" cy="4618990"/>
-                    </a:xfrm>
-                    <a:prstGeom prst="rect">
-                      <a:avLst/>
-                    </a:prstGeom>
-                  </pic:spPr>
-                </pic:pic>
-              </a:graphicData>
-            </a:graphic>
-          </wp:inline>
-        </w:drawing>
-      </w:r>
-      <w:r>
-        <w:rPr>
-          <w:rFonts w:cs="Arial"/>
-          <w:noProof/>
-          <w:color w:val="000000" w:themeColor="text1"/>
-          <w:sz w:val="24"/>
-          <w:szCs w:val="24"/>
-        </w:rPr>
-        <w:drawing>
-          <wp:inline distT="0" distB="0" distL="0" distR="0" wp14:anchorId="24923DB1" wp14:editId="19556D92">
-            <wp:extent cx="6583680" cy="3275965"/>
-            <wp:effectExtent l="0" t="0" r="7620" b="635"/>
-            <wp:docPr id="1122245460" name="Picture 1"/>
-            <wp:cNvGraphicFramePr>
-              <a:graphicFrameLocks xmlns:a="http://schemas.openxmlformats.org/drawingml/2006/main" noChangeAspect="1"/>
-            </wp:cNvGraphicFramePr>
-            <a:graphic xmlns:a="http://schemas.openxmlformats.org/drawingml/2006/main">
-              <a:graphicData uri="http://schemas.openxmlformats.org/drawingml/2006/picture">
-                <pic:pic xmlns:pic="http://schemas.openxmlformats.org/drawingml/2006/picture">
-                  <pic:nvPicPr>
-                    <pic:cNvPr id="1122245460" name=""/>
-                    <pic:cNvPicPr/>
-                  </pic:nvPicPr>
-                  <pic:blipFill>
-                    <a:blip r:embed="rId30"/>
-                    <a:stretch>
-                      <a:fillRect/>
-                    </a:stretch>
-                  </pic:blipFill>
-                  <pic:spPr>
-                    <a:xfrm>
-                      <a:off x="0" y="0"/>
-                      <a:ext cx="6583680" cy="3275965"/>
-                    </a:xfrm>
-                    <a:prstGeom prst="rect">
-                      <a:avLst/>
-                    </a:prstGeom>
-                  </pic:spPr>
-                </pic:pic>
-              </a:graphicData>
-            </a:graphic>
-          </wp:inline>
-        </w:drawing>
-      </w:r>
-    </w:p>
-    <w:p>
-      <w:r>
-        <w:rPr>
-          <w:noProof/>
-        </w:rPr>
-        <w:lastRenderedPageBreak/>
-        <w:drawing>
-          <wp:inline distT="0" distB="0" distL="0" distR="0" wp14:anchorId="026394DE" wp14:editId="0C70EDE1">
-            <wp:extent cx="6583680" cy="3275965"/>
-            <wp:effectExtent l="0" t="0" r="7620" b="635"/>
-            <wp:docPr id="610504766" name="Picture 1"/>
-            <wp:cNvGraphicFramePr>
-              <a:graphicFrameLocks xmlns:a="http://schemas.openxmlformats.org/drawingml/2006/main" noChangeAspect="1"/>
-            </wp:cNvGraphicFramePr>
-            <a:graphic xmlns:a="http://schemas.openxmlformats.org/drawingml/2006/main">
-              <a:graphicData uri="http://schemas.openxmlformats.org/drawingml/2006/picture">
-                <pic:pic xmlns:pic="http://schemas.openxmlformats.org/drawingml/2006/picture">
-                  <pic:nvPicPr>
-                    <pic:cNvPr id="610504766" name=""/>
                     <pic:cNvPicPr/>
                   </pic:nvPicPr>
                   <pic:blipFill>
@@ -7495,18 +7895,15 @@
           </wp:inline>
         </w:drawing>
       </w:r>
-    </w:p>
-    <w:p>
-      <w:pPr>
-        <w:pStyle w:val="IntenseQuote"/>
-        <w:ind w:left="0"/>
-        <w:rPr>
-          <w:rFonts w:cs="Arial"/>
-          <w:color w:val="000000" w:themeColor="text1"/>
-          <w:sz w:val="24"/>
-          <w:szCs w:val="24"/>
-        </w:rPr>
-      </w:pPr>
+      <w:r>
+        <w:rPr>
+          <w:rFonts w:cs="Arial"/>
+          <w:color w:val="000000" w:themeColor="text1"/>
+          <w:sz w:val="24"/>
+          <w:szCs w:val="24"/>
+        </w:rPr>
+        <w:t xml:space="preserve"> </w:t>
+      </w:r>
       <w:r>
         <w:rPr>
           <w:rFonts w:cs="Arial"/>
@@ -7516,10 +7913,10 @@
           <w:szCs w:val="24"/>
         </w:rPr>
         <w:drawing>
-          <wp:inline distT="0" distB="0" distL="0" distR="0" wp14:anchorId="3C6AB3ED" wp14:editId="6B55D876">
+          <wp:inline distT="0" distB="0" distL="0" distR="0" wp14:anchorId="0B9E40D8" wp14:editId="30A8880B">
             <wp:extent cx="6583680" cy="3275965"/>
             <wp:effectExtent l="0" t="0" r="7620" b="635"/>
-            <wp:docPr id="497125472" name="Picture 1"/>
+            <wp:docPr id="118094564" name="Picture 1"/>
             <wp:cNvGraphicFramePr>
               <a:graphicFrameLocks xmlns:a="http://schemas.openxmlformats.org/drawingml/2006/main" noChangeAspect="1"/>
             </wp:cNvGraphicFramePr>
@@ -7527,7 +7924,7 @@
               <a:graphicData uri="http://schemas.openxmlformats.org/drawingml/2006/picture">
                 <pic:pic xmlns:pic="http://schemas.openxmlformats.org/drawingml/2006/picture">
                   <pic:nvPicPr>
-                    <pic:cNvPr id="497125472" name=""/>
+                    <pic:cNvPr id="118094564" name=""/>
                     <pic:cNvPicPr/>
                   </pic:nvPicPr>
                   <pic:blipFill>
@@ -7554,19 +7951,19 @@
     </w:p>
     <w:p>
       <w:pPr>
-        <w:pStyle w:val="Heading2"/>
-        <w:rPr>
-          <w:rFonts w:ascii="Arial" w:hAnsi="Arial" w:cs="Arial"/>
-          <w:color w:val="000000" w:themeColor="text1"/>
-          <w:sz w:val="24"/>
-          <w:szCs w:val="24"/>
-        </w:rPr>
-      </w:pPr>
-      <w:r>
-        <w:rPr>
-          <w:rFonts w:ascii="Arial" w:eastAsiaTheme="minorEastAsia" w:hAnsi="Arial" w:cs="Arial"/>
-          <w:i/>
-          <w:iCs/>
+        <w:pStyle w:val="IntenseQuote"/>
+        <w:ind w:left="0"/>
+        <w:jc w:val="center"/>
+        <w:rPr>
+          <w:rFonts w:cs="Arial"/>
+          <w:color w:val="000000" w:themeColor="text1"/>
+          <w:sz w:val="24"/>
+          <w:szCs w:val="24"/>
+        </w:rPr>
+      </w:pPr>
+      <w:r>
+        <w:rPr>
+          <w:rFonts w:cs="Arial"/>
           <w:noProof/>
           <w:color w:val="000000" w:themeColor="text1"/>
           <w:sz w:val="24"/>
@@ -7574,10 +7971,10 @@
         </w:rPr>
         <w:lastRenderedPageBreak/>
         <w:drawing>
-          <wp:inline distT="0" distB="0" distL="0" distR="0" wp14:anchorId="7925AD3D" wp14:editId="357407EE">
+          <wp:inline distT="0" distB="0" distL="0" distR="0" wp14:anchorId="29250992" wp14:editId="7622AFF5">
             <wp:extent cx="6583680" cy="3275965"/>
             <wp:effectExtent l="0" t="0" r="7620" b="635"/>
-            <wp:docPr id="1760768964" name="Picture 1"/>
+            <wp:docPr id="95836812" name="Picture 1"/>
             <wp:cNvGraphicFramePr>
               <a:graphicFrameLocks xmlns:a="http://schemas.openxmlformats.org/drawingml/2006/main" noChangeAspect="1"/>
             </wp:cNvGraphicFramePr>
@@ -7585,7 +7982,7 @@
               <a:graphicData uri="http://schemas.openxmlformats.org/drawingml/2006/picture">
                 <pic:pic xmlns:pic="http://schemas.openxmlformats.org/drawingml/2006/picture">
                   <pic:nvPicPr>
-                    <pic:cNvPr id="1760768964" name=""/>
+                    <pic:cNvPr id="95836812" name=""/>
                     <pic:cNvPicPr/>
                   </pic:nvPicPr>
                   <pic:blipFill>
@@ -7611,6 +8008,263 @@
       </w:r>
       <w:r>
         <w:rPr>
+          <w:rFonts w:cs="Arial"/>
+          <w:i w:val="0"/>
+          <w:iCs w:val="0"/>
+          <w:color w:val="000000" w:themeColor="text1"/>
+          <w:sz w:val="24"/>
+          <w:szCs w:val="24"/>
+        </w:rPr>
+        <w:t>Farmer Side (Pages)</w:t>
+      </w:r>
+      <w:r>
+        <w:rPr>
+          <w:rFonts w:cs="Arial"/>
+          <w:noProof/>
+          <w:color w:val="000000" w:themeColor="text1"/>
+          <w:sz w:val="24"/>
+          <w:szCs w:val="24"/>
+        </w:rPr>
+        <w:lastRenderedPageBreak/>
+        <w:drawing>
+          <wp:inline distT="0" distB="0" distL="0" distR="0" wp14:anchorId="02BD52FB" wp14:editId="4D743011">
+            <wp:extent cx="6583680" cy="4618990"/>
+            <wp:effectExtent l="0" t="0" r="7620" b="0"/>
+            <wp:docPr id="1364353557" name="Picture 1"/>
+            <wp:cNvGraphicFramePr>
+              <a:graphicFrameLocks xmlns:a="http://schemas.openxmlformats.org/drawingml/2006/main" noChangeAspect="1"/>
+            </wp:cNvGraphicFramePr>
+            <a:graphic xmlns:a="http://schemas.openxmlformats.org/drawingml/2006/main">
+              <a:graphicData uri="http://schemas.openxmlformats.org/drawingml/2006/picture">
+                <pic:pic xmlns:pic="http://schemas.openxmlformats.org/drawingml/2006/picture">
+                  <pic:nvPicPr>
+                    <pic:cNvPr id="1364353557" name=""/>
+                    <pic:cNvPicPr/>
+                  </pic:nvPicPr>
+                  <pic:blipFill>
+                    <a:blip r:embed="rId34"/>
+                    <a:stretch>
+                      <a:fillRect/>
+                    </a:stretch>
+                  </pic:blipFill>
+                  <pic:spPr>
+                    <a:xfrm>
+                      <a:off x="0" y="0"/>
+                      <a:ext cx="6583680" cy="4618990"/>
+                    </a:xfrm>
+                    <a:prstGeom prst="rect">
+                      <a:avLst/>
+                    </a:prstGeom>
+                  </pic:spPr>
+                </pic:pic>
+              </a:graphicData>
+            </a:graphic>
+          </wp:inline>
+        </w:drawing>
+      </w:r>
+      <w:r>
+        <w:rPr>
+          <w:rFonts w:cs="Arial"/>
+          <w:noProof/>
+          <w:color w:val="000000" w:themeColor="text1"/>
+          <w:sz w:val="24"/>
+          <w:szCs w:val="24"/>
+        </w:rPr>
+        <w:drawing>
+          <wp:inline distT="0" distB="0" distL="0" distR="0" wp14:anchorId="24923DB1" wp14:editId="19556D92">
+            <wp:extent cx="6583680" cy="3275965"/>
+            <wp:effectExtent l="0" t="0" r="7620" b="635"/>
+            <wp:docPr id="1122245460" name="Picture 1"/>
+            <wp:cNvGraphicFramePr>
+              <a:graphicFrameLocks xmlns:a="http://schemas.openxmlformats.org/drawingml/2006/main" noChangeAspect="1"/>
+            </wp:cNvGraphicFramePr>
+            <a:graphic xmlns:a="http://schemas.openxmlformats.org/drawingml/2006/main">
+              <a:graphicData uri="http://schemas.openxmlformats.org/drawingml/2006/picture">
+                <pic:pic xmlns:pic="http://schemas.openxmlformats.org/drawingml/2006/picture">
+                  <pic:nvPicPr>
+                    <pic:cNvPr id="1122245460" name=""/>
+                    <pic:cNvPicPr/>
+                  </pic:nvPicPr>
+                  <pic:blipFill>
+                    <a:blip r:embed="rId35"/>
+                    <a:stretch>
+                      <a:fillRect/>
+                    </a:stretch>
+                  </pic:blipFill>
+                  <pic:spPr>
+                    <a:xfrm>
+                      <a:off x="0" y="0"/>
+                      <a:ext cx="6583680" cy="3275965"/>
+                    </a:xfrm>
+                    <a:prstGeom prst="rect">
+                      <a:avLst/>
+                    </a:prstGeom>
+                  </pic:spPr>
+                </pic:pic>
+              </a:graphicData>
+            </a:graphic>
+          </wp:inline>
+        </w:drawing>
+      </w:r>
+    </w:p>
+    <w:p>
+      <w:r>
+        <w:rPr>
+          <w:noProof/>
+        </w:rPr>
+        <w:lastRenderedPageBreak/>
+        <w:drawing>
+          <wp:inline distT="0" distB="0" distL="0" distR="0" wp14:anchorId="026394DE" wp14:editId="0C70EDE1">
+            <wp:extent cx="6583680" cy="3275965"/>
+            <wp:effectExtent l="0" t="0" r="7620" b="635"/>
+            <wp:docPr id="610504766" name="Picture 1"/>
+            <wp:cNvGraphicFramePr>
+              <a:graphicFrameLocks xmlns:a="http://schemas.openxmlformats.org/drawingml/2006/main" noChangeAspect="1"/>
+            </wp:cNvGraphicFramePr>
+            <a:graphic xmlns:a="http://schemas.openxmlformats.org/drawingml/2006/main">
+              <a:graphicData uri="http://schemas.openxmlformats.org/drawingml/2006/picture">
+                <pic:pic xmlns:pic="http://schemas.openxmlformats.org/drawingml/2006/picture">
+                  <pic:nvPicPr>
+                    <pic:cNvPr id="610504766" name=""/>
+                    <pic:cNvPicPr/>
+                  </pic:nvPicPr>
+                  <pic:blipFill>
+                    <a:blip r:embed="rId36"/>
+                    <a:stretch>
+                      <a:fillRect/>
+                    </a:stretch>
+                  </pic:blipFill>
+                  <pic:spPr>
+                    <a:xfrm>
+                      <a:off x="0" y="0"/>
+                      <a:ext cx="6583680" cy="3275965"/>
+                    </a:xfrm>
+                    <a:prstGeom prst="rect">
+                      <a:avLst/>
+                    </a:prstGeom>
+                  </pic:spPr>
+                </pic:pic>
+              </a:graphicData>
+            </a:graphic>
+          </wp:inline>
+        </w:drawing>
+      </w:r>
+    </w:p>
+    <w:p>
+      <w:pPr>
+        <w:pStyle w:val="IntenseQuote"/>
+        <w:ind w:left="0"/>
+        <w:rPr>
+          <w:rFonts w:cs="Arial"/>
+          <w:color w:val="000000" w:themeColor="text1"/>
+          <w:sz w:val="24"/>
+          <w:szCs w:val="24"/>
+        </w:rPr>
+      </w:pPr>
+      <w:r>
+        <w:rPr>
+          <w:rFonts w:cs="Arial"/>
+          <w:noProof/>
+          <w:color w:val="000000" w:themeColor="text1"/>
+          <w:sz w:val="24"/>
+          <w:szCs w:val="24"/>
+        </w:rPr>
+        <w:drawing>
+          <wp:inline distT="0" distB="0" distL="0" distR="0" wp14:anchorId="3C6AB3ED" wp14:editId="6B55D876">
+            <wp:extent cx="6583680" cy="3275965"/>
+            <wp:effectExtent l="0" t="0" r="7620" b="635"/>
+            <wp:docPr id="497125472" name="Picture 1"/>
+            <wp:cNvGraphicFramePr>
+              <a:graphicFrameLocks xmlns:a="http://schemas.openxmlformats.org/drawingml/2006/main" noChangeAspect="1"/>
+            </wp:cNvGraphicFramePr>
+            <a:graphic xmlns:a="http://schemas.openxmlformats.org/drawingml/2006/main">
+              <a:graphicData uri="http://schemas.openxmlformats.org/drawingml/2006/picture">
+                <pic:pic xmlns:pic="http://schemas.openxmlformats.org/drawingml/2006/picture">
+                  <pic:nvPicPr>
+                    <pic:cNvPr id="497125472" name=""/>
+                    <pic:cNvPicPr/>
+                  </pic:nvPicPr>
+                  <pic:blipFill>
+                    <a:blip r:embed="rId37"/>
+                    <a:stretch>
+                      <a:fillRect/>
+                    </a:stretch>
+                  </pic:blipFill>
+                  <pic:spPr>
+                    <a:xfrm>
+                      <a:off x="0" y="0"/>
+                      <a:ext cx="6583680" cy="3275965"/>
+                    </a:xfrm>
+                    <a:prstGeom prst="rect">
+                      <a:avLst/>
+                    </a:prstGeom>
+                  </pic:spPr>
+                </pic:pic>
+              </a:graphicData>
+            </a:graphic>
+          </wp:inline>
+        </w:drawing>
+      </w:r>
+    </w:p>
+    <w:p>
+      <w:pPr>
+        <w:pStyle w:val="Heading2"/>
+        <w:rPr>
+          <w:rFonts w:ascii="Arial" w:hAnsi="Arial" w:cs="Arial"/>
+          <w:color w:val="000000" w:themeColor="text1"/>
+          <w:sz w:val="24"/>
+          <w:szCs w:val="24"/>
+        </w:rPr>
+      </w:pPr>
+      <w:r>
+        <w:rPr>
+          <w:rFonts w:ascii="Arial" w:eastAsiaTheme="minorEastAsia" w:hAnsi="Arial" w:cs="Arial"/>
+          <w:i/>
+          <w:iCs/>
+          <w:noProof/>
+          <w:color w:val="000000" w:themeColor="text1"/>
+          <w:sz w:val="24"/>
+          <w:szCs w:val="24"/>
+        </w:rPr>
+        <w:lastRenderedPageBreak/>
+        <w:drawing>
+          <wp:inline distT="0" distB="0" distL="0" distR="0" wp14:anchorId="7925AD3D" wp14:editId="357407EE">
+            <wp:extent cx="6583680" cy="3275965"/>
+            <wp:effectExtent l="0" t="0" r="7620" b="635"/>
+            <wp:docPr id="1760768964" name="Picture 1"/>
+            <wp:cNvGraphicFramePr>
+              <a:graphicFrameLocks xmlns:a="http://schemas.openxmlformats.org/drawingml/2006/main" noChangeAspect="1"/>
+            </wp:cNvGraphicFramePr>
+            <a:graphic xmlns:a="http://schemas.openxmlformats.org/drawingml/2006/main">
+              <a:graphicData uri="http://schemas.openxmlformats.org/drawingml/2006/picture">
+                <pic:pic xmlns:pic="http://schemas.openxmlformats.org/drawingml/2006/picture">
+                  <pic:nvPicPr>
+                    <pic:cNvPr id="1760768964" name=""/>
+                    <pic:cNvPicPr/>
+                  </pic:nvPicPr>
+                  <pic:blipFill>
+                    <a:blip r:embed="rId38"/>
+                    <a:stretch>
+                      <a:fillRect/>
+                    </a:stretch>
+                  </pic:blipFill>
+                  <pic:spPr>
+                    <a:xfrm>
+                      <a:off x="0" y="0"/>
+                      <a:ext cx="6583680" cy="3275965"/>
+                    </a:xfrm>
+                    <a:prstGeom prst="rect">
+                      <a:avLst/>
+                    </a:prstGeom>
+                  </pic:spPr>
+                </pic:pic>
+              </a:graphicData>
+            </a:graphic>
+          </wp:inline>
+        </w:drawing>
+      </w:r>
+      <w:r>
+        <w:rPr>
           <w:rFonts w:ascii="Arial" w:eastAsiaTheme="minorEastAsia" w:hAnsi="Arial" w:cs="Arial"/>
           <w:i/>
           <w:iCs/>
@@ -7676,7 +8330,7 @@
                     <pic:cNvPicPr/>
                   </pic:nvPicPr>
                   <pic:blipFill>
-                    <a:blip r:embed="rId34"/>
+                    <a:blip r:embed="rId39"/>
                     <a:stretch>
                       <a:fillRect/>
                     </a:stretch>
@@ -7760,7 +8414,7 @@
                     <pic:cNvPicPr/>
                   </pic:nvPicPr>
                   <pic:blipFill>
-                    <a:blip r:embed="rId35"/>
+                    <a:blip r:embed="rId40"/>
                     <a:stretch>
                       <a:fillRect/>
                     </a:stretch>
@@ -7818,7 +8472,27 @@
           <w:sz w:val="24"/>
           <w:szCs w:val="24"/>
         </w:rPr>
-        <w:t>The default classroom version stores its records in the local SQLite database located at instance/bananacare.db. The database can be inspected using DB Browser for SQLite. PostgreSQL can also be used by configuring DATABASE_URL in the local .env file.</w:t>
+        <w:t>The default classroom version stores its records in the local SQLite database located at instance/</w:t>
+      </w:r>
+      <w:proofErr w:type="spellStart"/>
+      <w:r>
+        <w:rPr>
+          <w:rFonts w:cs="Arial"/>
+          <w:color w:val="000000" w:themeColor="text1"/>
+          <w:sz w:val="24"/>
+          <w:szCs w:val="24"/>
+        </w:rPr>
+        <w:t>bananacare.db</w:t>
+      </w:r>
+      <w:proofErr w:type="spellEnd"/>
+      <w:r>
+        <w:rPr>
+          <w:rFonts w:cs="Arial"/>
+          <w:color w:val="000000" w:themeColor="text1"/>
+          <w:sz w:val="24"/>
+          <w:szCs w:val="24"/>
+        </w:rPr>
+        <w:t>. The database can be inspected using DB Browser for SQLite. PostgreSQL can also be used by configuring DATABASE_URL in the local .env file.</w:t>
       </w:r>
     </w:p>
     <w:p>
@@ -7870,14 +8544,25 @@
           <w:szCs w:val="24"/>
         </w:rPr>
       </w:pPr>
-      <w:r>
-        <w:rPr>
-          <w:rFonts w:cs="Arial"/>
-          <w:color w:val="000000" w:themeColor="text1"/>
-          <w:sz w:val="24"/>
-          <w:szCs w:val="24"/>
-        </w:rPr>
-        <w:t>farmer_profile – stores farmer and farm information.</w:t>
+      <w:proofErr w:type="spellStart"/>
+      <w:r>
+        <w:rPr>
+          <w:rFonts w:cs="Arial"/>
+          <w:color w:val="000000" w:themeColor="text1"/>
+          <w:sz w:val="24"/>
+          <w:szCs w:val="24"/>
+        </w:rPr>
+        <w:t>farmer_profile</w:t>
+      </w:r>
+      <w:proofErr w:type="spellEnd"/>
+      <w:r>
+        <w:rPr>
+          <w:rFonts w:cs="Arial"/>
+          <w:color w:val="000000" w:themeColor="text1"/>
+          <w:sz w:val="24"/>
+          <w:szCs w:val="24"/>
+        </w:rPr>
+        <w:t xml:space="preserve"> – stores farmer and farm information.</w:t>
       </w:r>
     </w:p>
     <w:p>
@@ -7890,14 +8575,25 @@
           <w:szCs w:val="24"/>
         </w:rPr>
       </w:pPr>
-      <w:r>
-        <w:rPr>
-          <w:rFonts w:cs="Arial"/>
-          <w:color w:val="000000" w:themeColor="text1"/>
-          <w:sz w:val="24"/>
-          <w:szCs w:val="24"/>
-        </w:rPr>
-        <w:t>disease_report – stores reported farm conditions, affected area, status, and Admin remarks.</w:t>
+      <w:proofErr w:type="spellStart"/>
+      <w:r>
+        <w:rPr>
+          <w:rFonts w:cs="Arial"/>
+          <w:color w:val="000000" w:themeColor="text1"/>
+          <w:sz w:val="24"/>
+          <w:szCs w:val="24"/>
+        </w:rPr>
+        <w:t>disease_report</w:t>
+      </w:r>
+      <w:proofErr w:type="spellEnd"/>
+      <w:r>
+        <w:rPr>
+          <w:rFonts w:cs="Arial"/>
+          <w:color w:val="000000" w:themeColor="text1"/>
+          <w:sz w:val="24"/>
+          <w:szCs w:val="24"/>
+        </w:rPr>
+        <w:t xml:space="preserve"> – stores reported farm conditions, affected area, status, and Admin remarks.</w:t>
       </w:r>
     </w:p>
     <w:p>
@@ -7953,7 +8649,7 @@
                     <pic:cNvPicPr/>
                   </pic:nvPicPr>
                   <pic:blipFill>
-                    <a:blip r:embed="rId36"/>
+                    <a:blip r:embed="rId41"/>
                     <a:stretch>
                       <a:fillRect/>
                     </a:stretch>
@@ -8007,7 +8703,7 @@
                     <pic:cNvPicPr/>
                   </pic:nvPicPr>
                   <pic:blipFill>
-                    <a:blip r:embed="rId37"/>
+                    <a:blip r:embed="rId42"/>
                     <a:stretch>
                       <a:fillRect/>
                     </a:stretch>
@@ -8061,7 +8757,7 @@
                     <pic:cNvPicPr/>
                   </pic:nvPicPr>
                   <pic:blipFill>
-                    <a:blip r:embed="rId38"/>
+                    <a:blip r:embed="rId43"/>
                     <a:stretch>
                       <a:fillRect/>
                     </a:stretch>
@@ -8115,7 +8811,7 @@
                     <pic:cNvPicPr/>
                   </pic:nvPicPr>
                   <pic:blipFill>
-                    <a:blip r:embed="rId39"/>
+                    <a:blip r:embed="rId44"/>
                     <a:stretch>
                       <a:fillRect/>
                     </a:stretch>
@@ -8170,7 +8866,7 @@
                     <pic:cNvPicPr/>
                   </pic:nvPicPr>
                   <pic:blipFill>
-                    <a:blip r:embed="rId40"/>
+                    <a:blip r:embed="rId45"/>
                     <a:stretch>
                       <a:fillRect/>
                     </a:stretch>
@@ -8338,7 +9034,7 @@
   <w:abstractNum w:abstractNumId="7" w15:restartNumberingAfterBreak="0">
     <w:nsid w:val="FFFFFF88"/>
     <w:multiLevelType w:val="singleLevel"/>
-    <w:tmpl w:val="D0A62B40"/>
+    <w:tmpl w:val="D53613CA"/>
     <w:lvl w:ilvl="0">
       <w:start w:val="1"/>
       <w:numFmt w:val="decimal"/>
@@ -8372,6 +9068,95 @@
       <w:rPr>
         <w:rFonts w:ascii="Symbol" w:hAnsi="Symbol" w:hint="default"/>
       </w:rPr>
+    </w:lvl>
+  </w:abstractNum>
+  <w:abstractNum w:abstractNumId="9" w15:restartNumberingAfterBreak="0">
+    <w:nsid w:val="059716B5"/>
+    <w:multiLevelType w:val="hybridMultilevel"/>
+    <w:tmpl w:val="78ACF458"/>
+    <w:lvl w:ilvl="0" w:tplc="3409000F">
+      <w:start w:val="1"/>
+      <w:numFmt w:val="decimal"/>
+      <w:lvlText w:val="%1."/>
+      <w:lvlJc w:val="left"/>
+      <w:pPr>
+        <w:ind w:left="720" w:hanging="360"/>
+      </w:pPr>
+      <w:rPr>
+        <w:rFonts w:hint="default"/>
+      </w:rPr>
+    </w:lvl>
+    <w:lvl w:ilvl="1" w:tplc="34090019" w:tentative="1">
+      <w:start w:val="1"/>
+      <w:numFmt w:val="lowerLetter"/>
+      <w:lvlText w:val="%2."/>
+      <w:lvlJc w:val="left"/>
+      <w:pPr>
+        <w:ind w:left="1440" w:hanging="360"/>
+      </w:pPr>
+    </w:lvl>
+    <w:lvl w:ilvl="2" w:tplc="3409001B" w:tentative="1">
+      <w:start w:val="1"/>
+      <w:numFmt w:val="lowerRoman"/>
+      <w:lvlText w:val="%3."/>
+      <w:lvlJc w:val="right"/>
+      <w:pPr>
+        <w:ind w:left="2160" w:hanging="180"/>
+      </w:pPr>
+    </w:lvl>
+    <w:lvl w:ilvl="3" w:tplc="3409000F" w:tentative="1">
+      <w:start w:val="1"/>
+      <w:numFmt w:val="decimal"/>
+      <w:lvlText w:val="%4."/>
+      <w:lvlJc w:val="left"/>
+      <w:pPr>
+        <w:ind w:left="2880" w:hanging="360"/>
+      </w:pPr>
+    </w:lvl>
+    <w:lvl w:ilvl="4" w:tplc="34090019" w:tentative="1">
+      <w:start w:val="1"/>
+      <w:numFmt w:val="lowerLetter"/>
+      <w:lvlText w:val="%5."/>
+      <w:lvlJc w:val="left"/>
+      <w:pPr>
+        <w:ind w:left="3600" w:hanging="360"/>
+      </w:pPr>
+    </w:lvl>
+    <w:lvl w:ilvl="5" w:tplc="3409001B" w:tentative="1">
+      <w:start w:val="1"/>
+      <w:numFmt w:val="lowerRoman"/>
+      <w:lvlText w:val="%6."/>
+      <w:lvlJc w:val="right"/>
+      <w:pPr>
+        <w:ind w:left="4320" w:hanging="180"/>
+      </w:pPr>
+    </w:lvl>
+    <w:lvl w:ilvl="6" w:tplc="3409000F" w:tentative="1">
+      <w:start w:val="1"/>
+      <w:numFmt w:val="decimal"/>
+      <w:lvlText w:val="%7."/>
+      <w:lvlJc w:val="left"/>
+      <w:pPr>
+        <w:ind w:left="5040" w:hanging="360"/>
+      </w:pPr>
+    </w:lvl>
+    <w:lvl w:ilvl="7" w:tplc="34090019" w:tentative="1">
+      <w:start w:val="1"/>
+      <w:numFmt w:val="lowerLetter"/>
+      <w:lvlText w:val="%8."/>
+      <w:lvlJc w:val="left"/>
+      <w:pPr>
+        <w:ind w:left="5760" w:hanging="360"/>
+      </w:pPr>
+    </w:lvl>
+    <w:lvl w:ilvl="8" w:tplc="3409001B" w:tentative="1">
+      <w:start w:val="1"/>
+      <w:numFmt w:val="lowerRoman"/>
+      <w:lvlText w:val="%9."/>
+      <w:lvlJc w:val="right"/>
+      <w:pPr>
+        <w:ind w:left="6480" w:hanging="180"/>
+      </w:pPr>
     </w:lvl>
   </w:abstractNum>
   <w:num w:numId="1" w16cid:durableId="830029358">
@@ -8400,6 +9185,12 @@
   </w:num>
   <w:num w:numId="9" w16cid:durableId="1851796386">
     <w:abstractNumId w:val="0"/>
+  </w:num>
+  <w:num w:numId="10" w16cid:durableId="411850653">
+    <w:abstractNumId w:val="7"/>
+  </w:num>
+  <w:num w:numId="11" w16cid:durableId="729965619">
+    <w:abstractNumId w:val="9"/>
   </w:num>
 </w:numbering>
 </file>

</xml_diff>